<commit_message>
CANONICAL RULE enforced: all docx (task files + OV01 golden) through the one Epic template via epic.py; rebuilt + verified subset of world vocab; DO-NOT-REPEAT entry
</commit_message>
<xml_diff>
--- a/worlds/ondina-vasquell/phase-3-build-task-artifacts/platform/task1/current/golden-OV01-v1.docx
+++ b/worlds/ondina-vasquell/phase-3-build-task-artifacts/platform/task1/current/golden-OV01-v1.docx
@@ -2,132 +2,171 @@
 <file path=word/document.xml><?xml version="1.0" encoding="utf-8"?>
 <w:document xmlns:wpc="http://schemas.microsoft.com/office/word/2010/wordprocessingCanvas" xmlns:mo="http://schemas.microsoft.com/office/mac/office/2008/main" xmlns:mc="http://schemas.openxmlformats.org/markup-compatibility/2006" xmlns:mv="urn:schemas-microsoft-com:mac:vml" xmlns:o="urn:schemas-microsoft-com:office:office" xmlns:r="http://schemas.openxmlformats.org/officeDocument/2006/relationships" xmlns:m="http://schemas.openxmlformats.org/officeDocument/2006/math" xmlns:v="urn:schemas-microsoft-com:vml" xmlns:wp14="http://schemas.microsoft.com/office/word/2010/wordprocessingDrawing" xmlns:wp="http://schemas.openxmlformats.org/drawingml/2006/wordprocessingDrawing" xmlns:w10="urn:schemas-microsoft-com:office:word" xmlns:w="http://schemas.openxmlformats.org/wordprocessingml/2006/main" xmlns:w14="http://schemas.microsoft.com/office/word/2010/wordml" xmlns:wpg="http://schemas.microsoft.com/office/word/2010/wordprocessingGroup" xmlns:wpi="http://schemas.microsoft.com/office/word/2010/wordprocessingInk" xmlns:wne="http://schemas.microsoft.com/office/word/2006/wordml" xmlns:wps="http://schemas.microsoft.com/office/word/2010/wordprocessingShape" mc:Ignorable="w14 wp14">
   <w:body>
-    <w:p>
-      <w:r>
-        <w:rPr>
-          <w:rFonts w:ascii="Arial" w:hAnsi="Arial"/>
-          <w:b/>
-          <w:color w:val="111111"/>
-          <w:sz w:val="28"/>
-        </w:rPr>
-        <w:t>DISCHARGE MEDICATION RECONCILIATION</w:t>
-      </w:r>
-    </w:p>
-    <w:p>
-      <w:r>
-        <w:rPr>
-          <w:rFonts w:ascii="Arial" w:hAnsi="Arial"/>
-          <w:b w:val="0"/>
-          <w:color w:val="5E6670"/>
-          <w:sz w:val="17"/>
-        </w:rPr>
-        <w:t>Author: Marisol Everet, MD  |  Department: Hospital Medicine  |  Date of Service: 05/22/2026 0830  |  Status: Draft for physician sign</w:t>
-      </w:r>
-    </w:p>
-    <w:p>
-      <w:r>
-        <w:rPr>
-          <w:rFonts w:ascii="Arial" w:hAnsi="Arial"/>
-          <w:b w:val="0"/>
-          <w:color w:val="5E6670"/>
-          <w:sz w:val="17"/>
-        </w:rPr>
-        <w:t>Patient: Ondina Vasquell  |  MRN OV-3358104  |  DOB 03/14/1958</w:t>
-      </w:r>
-    </w:p>
-    <w:p>
-      <w:r>
-        <w:rPr>
-          <w:rFonts w:ascii="Arial" w:hAnsi="Arial"/>
-          <w:b/>
-          <w:color w:val="1F3864"/>
-          <w:sz w:val="22"/>
-        </w:rPr>
-        <w:t>SOURCES REVIEWED</w:t>
-      </w:r>
-    </w:p>
-    <w:p>
-      <w:r>
-        <w:rPr>
-          <w:rFonts w:ascii="Arial" w:hAnsi="Arial"/>
-          <w:b w:val="0"/>
-          <w:color w:val="111111"/>
-          <w:sz w:val="21"/>
-        </w:rPr>
-        <w:t>Home medication list, medication administration record, admission medication-hold orders, renal function trend, infectious disease notes, and the preliminary unreconciled discharge order set.</w:t>
-      </w:r>
-    </w:p>
-    <w:p>
-      <w:r>
-        <w:rPr>
-          <w:rFonts w:ascii="Arial" w:hAnsi="Arial"/>
-          <w:b/>
-          <w:color w:val="1F3864"/>
-          <w:sz w:val="22"/>
-        </w:rPr>
-        <w:t>RECONCILED MEDICATIONS</w:t>
-      </w:r>
-    </w:p>
     <w:tbl>
       <w:tblPr>
-        <w:tblStyle w:val="TableGrid"/>
         <w:tblW w:type="auto" w:w="0"/>
         <w:tblLook w:firstColumn="1" w:firstRow="1" w:lastColumn="0" w:lastRow="0" w:noHBand="0" w:noVBand="1" w:val="04A0"/>
+        <w:tblBorders>
+          <w:top w:val="none"/>
+          <w:left w:val="none"/>
+          <w:bottom w:val="none"/>
+          <w:right w:val="none"/>
+          <w:insideH w:val="none"/>
+          <w:insideV w:val="none"/>
+        </w:tblBorders>
       </w:tblPr>
       <w:tblGrid>
-        <w:gridCol w:w="2880"/>
-        <w:gridCol w:w="2880"/>
-        <w:gridCol w:w="2880"/>
+        <w:gridCol w:w="5184"/>
+        <w:gridCol w:w="5184"/>
       </w:tblGrid>
       <w:tr>
         <w:tc>
           <w:tcPr>
-            <w:tcW w:type="dxa" w:w="2880"/>
+            <w:tcW w:type="dxa" w:w="5184"/>
           </w:tcPr>
           <w:p>
-            <w:r/>
             <w:r>
               <w:rPr>
                 <w:rFonts w:ascii="Arial" w:hAnsi="Arial"/>
                 <w:b/>
-                <w:color w:val="111111"/>
-                <w:sz w:val="18"/>
+                <w:i w:val="0"/>
+                <w:color w:val="1F3864"/>
+                <w:sz w:val="22"/>
               </w:rPr>
-              <w:t>Medication</w:t>
+              <w:t>Harbor Crest Regional Medical Center</w:t>
+            </w:r>
+          </w:p>
+          <w:p>
+            <w:r>
+              <w:rPr>
+                <w:rFonts w:ascii="Arial" w:hAnsi="Arial"/>
+                <w:b w:val="0"/>
+                <w:i w:val="0"/>
+                <w:color w:val="5E6670"/>
+                <w:sz w:val="16"/>
+              </w:rPr>
+              <w:t>Hospital Medicine</w:t>
             </w:r>
           </w:p>
         </w:tc>
         <w:tc>
           <w:tcPr>
-            <w:tcW w:type="dxa" w:w="2880"/>
+            <w:tcW w:type="dxa" w:w="5184"/>
           </w:tcPr>
           <w:p>
-            <w:r/>
+            <w:pPr>
+              <w:jc w:val="right"/>
+            </w:pPr>
             <w:r>
               <w:rPr>
                 <w:rFonts w:ascii="Arial" w:hAnsi="Arial"/>
                 <w:b/>
-                <w:color w:val="111111"/>
+                <w:i w:val="0"/>
+                <w:color w:val="4472C4"/>
+                <w:sz w:val="17"/>
+              </w:rPr>
+              <w:t>Confidential</w:t>
+            </w:r>
+          </w:p>
+        </w:tc>
+      </w:tr>
+    </w:tbl>
+    <w:tbl>
+      <w:tblPr>
+        <w:tblW w:type="auto" w:w="0"/>
+        <w:tblLook w:firstColumn="1" w:firstRow="1" w:lastColumn="0" w:lastRow="0" w:noHBand="0" w:noVBand="1" w:val="04A0"/>
+        <w:tblBorders>
+          <w:top w:val="none"/>
+          <w:left w:val="none"/>
+          <w:bottom w:val="none"/>
+          <w:right w:val="none"/>
+          <w:insideH w:val="none"/>
+          <w:insideV w:val="none"/>
+        </w:tblBorders>
+      </w:tblPr>
+      <w:tblGrid>
+        <w:gridCol w:w="10368"/>
+      </w:tblGrid>
+      <w:tr>
+        <w:trPr>
+          <w:trHeight w:val="40"/>
+        </w:trPr>
+        <w:tc>
+          <w:tcPr>
+            <w:tcW w:type="dxa" w:w="10368"/>
+            <w:shd w:val="clear" w:fill="4472C4"/>
+          </w:tcPr>
+          <w:p/>
+        </w:tc>
+      </w:tr>
+    </w:tbl>
+    <w:tbl>
+      <w:tblPr>
+        <w:tblW w:type="auto" w:w="0"/>
+        <w:tblLook w:firstColumn="1" w:firstRow="1" w:lastColumn="0" w:lastRow="0" w:noHBand="0" w:noVBand="1" w:val="04A0"/>
+        <w:tblBorders>
+          <w:top w:val="single" w:sz="4" w:color="C9D4EA"/>
+          <w:left w:val="single" w:sz="4" w:color="C9D4EA"/>
+          <w:bottom w:val="single" w:sz="4" w:color="C9D4EA"/>
+          <w:right w:val="single" w:sz="4" w:color="C9D4EA"/>
+          <w:insideH w:val="single" w:sz="4" w:color="C9D4EA"/>
+          <w:insideV w:val="single" w:sz="4" w:color="C9D4EA"/>
+        </w:tblBorders>
+      </w:tblPr>
+      <w:tblGrid>
+        <w:gridCol w:w="2592"/>
+        <w:gridCol w:w="2592"/>
+        <w:gridCol w:w="2592"/>
+        <w:gridCol w:w="2592"/>
+      </w:tblGrid>
+      <w:tr>
+        <w:tc>
+          <w:tcPr>
+            <w:tcW w:type="dxa" w:w="7776"/>
+            <w:gridSpan w:val="3"/>
+            <w:shd w:val="clear" w:fill="4472C4"/>
+          </w:tcPr>
+          <w:p>
+            <w:r>
+              <w:rPr>
+                <w:rFonts w:ascii="Arial" w:hAnsi="Arial"/>
+                <w:b/>
+                <w:i w:val="0"/>
+                <w:color w:val="FFFFFF"/>
+                <w:sz w:val="26"/>
+              </w:rPr>
+              <w:t xml:space="preserve">  Ondina Vasquell</w:t>
+            </w:r>
+            <w:r>
+              <w:rPr>
+                <w:rFonts w:ascii="Arial" w:hAnsi="Arial"/>
+                <w:b w:val="0"/>
+                <w:i w:val="0"/>
+                <w:color w:val="FFFFFF"/>
                 <w:sz w:val="18"/>
               </w:rPr>
-              <w:t>Disposition</w:t>
+              <w:t xml:space="preserve">    68 y  |  Female  |  DOB 03/14/1958</w:t>
             </w:r>
           </w:p>
         </w:tc>
         <w:tc>
           <w:tcPr>
-            <w:tcW w:type="dxa" w:w="2880"/>
+            <w:tcW w:type="dxa" w:w="2592"/>
+            <w:shd w:val="clear" w:fill="4472C4"/>
           </w:tcPr>
           <w:p>
-            <w:r/>
+            <w:pPr>
+              <w:jc w:val="right"/>
+            </w:pPr>
             <w:r>
               <w:rPr>
                 <w:rFonts w:ascii="Arial" w:hAnsi="Arial"/>
                 <w:b/>
-                <w:color w:val="111111"/>
-                <w:sz w:val="18"/>
+                <w:i w:val="0"/>
+                <w:color w:val="FFFFFF"/>
+                <w:sz w:val="20"/>
               </w:rPr>
-              <w:t>Rationale</w:t>
+              <w:t xml:space="preserve">MRN OV-3358104  </w:t>
             </w:r>
           </w:p>
         </w:tc>
@@ -135,794 +174,117 @@
       <w:tr>
         <w:tc>
           <w:tcPr>
-            <w:tcW w:type="dxa" w:w="2880"/>
+            <w:tcW w:type="dxa" w:w="2592"/>
+            <w:shd w:val="clear" w:fill="EDF2FA"/>
           </w:tcPr>
           <w:p>
-            <w:r/>
+            <w:r>
+              <w:rPr>
+                <w:rFonts w:ascii="Arial" w:hAnsi="Arial"/>
+                <w:b/>
+                <w:i w:val="0"/>
+                <w:color w:val="5E6670"/>
+                <w:sz w:val="14"/>
+              </w:rPr>
+              <w:t>Date of Service</w:t>
+              <w:br/>
+            </w:r>
             <w:r>
               <w:rPr>
                 <w:rFonts w:ascii="Arial" w:hAnsi="Arial"/>
                 <w:b w:val="0"/>
-                <w:color w:val="111111"/>
-                <w:sz w:val="18"/>
+                <w:i w:val="0"/>
+                <w:color w:val="232830"/>
+                <w:sz w:val="16"/>
               </w:rPr>
-              <w:t>Insulin glargine 26 units Subcutaneous nightly</w:t>
+              <w:t>05/22/2026</w:t>
             </w:r>
           </w:p>
         </w:tc>
         <w:tc>
           <w:tcPr>
-            <w:tcW w:type="dxa" w:w="2880"/>
+            <w:tcW w:type="dxa" w:w="2592"/>
+            <w:shd w:val="clear" w:fill="EDF2FA"/>
           </w:tcPr>
           <w:p>
-            <w:r/>
+            <w:r>
+              <w:rPr>
+                <w:rFonts w:ascii="Arial" w:hAnsi="Arial"/>
+                <w:b/>
+                <w:i w:val="0"/>
+                <w:color w:val="5E6670"/>
+                <w:sz w:val="14"/>
+              </w:rPr>
+              <w:t>Author</w:t>
+              <w:br/>
+            </w:r>
             <w:r>
               <w:rPr>
                 <w:rFonts w:ascii="Arial" w:hAnsi="Arial"/>
                 <w:b w:val="0"/>
-                <w:color w:val="111111"/>
-                <w:sz w:val="18"/>
+                <w:i w:val="0"/>
+                <w:color w:val="232830"/>
+                <w:sz w:val="16"/>
               </w:rPr>
-              <w:t>Continue, adjust to intake</w:t>
+              <w:t>Marisol Everet, MD</w:t>
             </w:r>
           </w:p>
         </w:tc>
         <w:tc>
           <w:tcPr>
-            <w:tcW w:type="dxa" w:w="2880"/>
+            <w:tcW w:type="dxa" w:w="2592"/>
+            <w:shd w:val="clear" w:fill="EDF2FA"/>
           </w:tcPr>
           <w:p>
-            <w:r/>
+            <w:r>
+              <w:rPr>
+                <w:rFonts w:ascii="Arial" w:hAnsi="Arial"/>
+                <w:b/>
+                <w:i w:val="0"/>
+                <w:color w:val="5E6670"/>
+                <w:sz w:val="14"/>
+              </w:rPr>
+              <w:t>Allergies</w:t>
+              <w:br/>
+            </w:r>
             <w:r>
               <w:rPr>
                 <w:rFonts w:ascii="Arial" w:hAnsi="Arial"/>
                 <w:b w:val="0"/>
-                <w:color w:val="111111"/>
-                <w:sz w:val="18"/>
+                <w:i w:val="0"/>
+                <w:color w:val="232830"/>
+                <w:sz w:val="16"/>
               </w:rPr>
-              <w:t>Home basal insulin, continued through the stay.</w:t>
-            </w:r>
-          </w:p>
-        </w:tc>
-      </w:tr>
-      <w:tr>
-        <w:tc>
-          <w:tcPr>
-            <w:tcW w:type="dxa" w:w="2880"/>
-          </w:tcPr>
-          <w:p>
-            <w:r/>
-            <w:r>
-              <w:rPr>
-                <w:rFonts w:ascii="Arial" w:hAnsi="Arial"/>
-                <w:b w:val="0"/>
-                <w:color w:val="111111"/>
-                <w:sz w:val="18"/>
-              </w:rPr>
-              <w:t>Insulin aspart sliding scale Subcutaneous with meals</w:t>
+              <w:t>Sulfa (sulfonamide antibiotics) - rash</w:t>
             </w:r>
           </w:p>
         </w:tc>
         <w:tc>
           <w:tcPr>
-            <w:tcW w:type="dxa" w:w="2880"/>
+            <w:tcW w:type="dxa" w:w="2592"/>
+            <w:shd w:val="clear" w:fill="EDF2FA"/>
           </w:tcPr>
           <w:p>
-            <w:r/>
+            <w:r>
+              <w:rPr>
+                <w:rFonts w:ascii="Arial" w:hAnsi="Arial"/>
+                <w:b/>
+                <w:i w:val="0"/>
+                <w:color w:val="5E6670"/>
+                <w:sz w:val="14"/>
+              </w:rPr>
+              <w:t>Document</w:t>
+              <w:br/>
+            </w:r>
             <w:r>
               <w:rPr>
                 <w:rFonts w:ascii="Arial" w:hAnsi="Arial"/>
                 <w:b w:val="0"/>
-                <w:color w:val="111111"/>
-                <w:sz w:val="18"/>
+                <w:i w:val="0"/>
+                <w:color w:val="232830"/>
+                <w:sz w:val="16"/>
               </w:rPr>
-              <w:t>Continue</w:t>
-            </w:r>
-          </w:p>
-        </w:tc>
-        <w:tc>
-          <w:tcPr>
-            <w:tcW w:type="dxa" w:w="2880"/>
-          </w:tcPr>
-          <w:p>
-            <w:r/>
-            <w:r>
-              <w:rPr>
-                <w:rFonts w:ascii="Arial" w:hAnsi="Arial"/>
-                <w:b w:val="0"/>
-                <w:color w:val="111111"/>
-                <w:sz w:val="18"/>
-              </w:rPr>
-              <w:t>Prandial coverage, no change indicated.</w:t>
-            </w:r>
-          </w:p>
-        </w:tc>
-      </w:tr>
-      <w:tr>
-        <w:tc>
-          <w:tcPr>
-            <w:tcW w:type="dxa" w:w="2880"/>
-          </w:tcPr>
-          <w:p>
-            <w:r/>
-            <w:r>
-              <w:rPr>
-                <w:rFonts w:ascii="Arial" w:hAnsi="Arial"/>
-                <w:b w:val="0"/>
-                <w:color w:val="111111"/>
-                <w:sz w:val="18"/>
-              </w:rPr>
-              <w:t>Metformin 500 mg Oral twice daily</w:t>
-            </w:r>
-          </w:p>
-        </w:tc>
-        <w:tc>
-          <w:tcPr>
-            <w:tcW w:type="dxa" w:w="2880"/>
-          </w:tcPr>
-          <w:p>
-            <w:r/>
-            <w:r>
-              <w:rPr>
-                <w:rFonts w:ascii="Arial" w:hAnsi="Arial"/>
-                <w:b w:val="0"/>
-                <w:color w:val="111111"/>
-                <w:sz w:val="18"/>
-              </w:rPr>
-              <w:t>Defer restart, remains held</w:t>
-            </w:r>
-          </w:p>
-        </w:tc>
-        <w:tc>
-          <w:tcPr>
-            <w:tcW w:type="dxa" w:w="2880"/>
-          </w:tcPr>
-          <w:p>
-            <w:r/>
-            <w:r>
-              <w:rPr>
-                <w:rFonts w:ascii="Arial" w:hAnsi="Arial"/>
-                <w:b w:val="0"/>
-                <w:color w:val="111111"/>
-                <w:sz w:val="18"/>
-              </w:rPr>
-              <w:t>Held for acute kidney injury on chronic kidney disease, eGFR in the 30s near the metformin threshold. Resume only after renal function is confirmed stable as an outpatient. Do not resume at discharge.</w:t>
-            </w:r>
-          </w:p>
-        </w:tc>
-      </w:tr>
-      <w:tr>
-        <w:tc>
-          <w:tcPr>
-            <w:tcW w:type="dxa" w:w="2880"/>
-          </w:tcPr>
-          <w:p>
-            <w:r/>
-            <w:r>
-              <w:rPr>
-                <w:rFonts w:ascii="Arial" w:hAnsi="Arial"/>
-                <w:b w:val="0"/>
-                <w:color w:val="111111"/>
-                <w:sz w:val="18"/>
-              </w:rPr>
-              <w:t>Empagliflozin 10 mg Oral daily</w:t>
-            </w:r>
-          </w:p>
-        </w:tc>
-        <w:tc>
-          <w:tcPr>
-            <w:tcW w:type="dxa" w:w="2880"/>
-          </w:tcPr>
-          <w:p>
-            <w:r/>
-            <w:r>
-              <w:rPr>
-                <w:rFonts w:ascii="Arial" w:hAnsi="Arial"/>
-                <w:b w:val="0"/>
-                <w:color w:val="111111"/>
-                <w:sz w:val="18"/>
-              </w:rPr>
-              <w:t>Defer restart, remains held</w:t>
-            </w:r>
-          </w:p>
-        </w:tc>
-        <w:tc>
-          <w:tcPr>
-            <w:tcW w:type="dxa" w:w="2880"/>
-          </w:tcPr>
-          <w:p>
-            <w:r/>
-            <w:r>
-              <w:rPr>
-                <w:rFonts w:ascii="Arial" w:hAnsi="Arial"/>
-                <w:b w:val="0"/>
-                <w:color w:val="111111"/>
-                <w:sz w:val="18"/>
-              </w:rPr>
-              <w:t>Held during acute infection for sick-day and euglycemic ketoacidosis risk. Resume as an outpatient once the acute illness has resolved and intake is reliable.</w:t>
-            </w:r>
-          </w:p>
-        </w:tc>
-      </w:tr>
-      <w:tr>
-        <w:tc>
-          <w:tcPr>
-            <w:tcW w:type="dxa" w:w="2880"/>
-          </w:tcPr>
-          <w:p>
-            <w:r/>
-            <w:r>
-              <w:rPr>
-                <w:rFonts w:ascii="Arial" w:hAnsi="Arial"/>
-                <w:b w:val="0"/>
-                <w:color w:val="111111"/>
-                <w:sz w:val="18"/>
-              </w:rPr>
-              <w:t>Lisinopril 20 mg Oral daily</w:t>
-            </w:r>
-          </w:p>
-        </w:tc>
-        <w:tc>
-          <w:tcPr>
-            <w:tcW w:type="dxa" w:w="2880"/>
-          </w:tcPr>
-          <w:p>
-            <w:r/>
-            <w:r>
-              <w:rPr>
-                <w:rFonts w:ascii="Arial" w:hAnsi="Arial"/>
-                <w:b w:val="0"/>
-                <w:color w:val="111111"/>
-                <w:sz w:val="18"/>
-              </w:rPr>
-              <w:t>Defer restart, remains held</w:t>
-            </w:r>
-          </w:p>
-        </w:tc>
-        <w:tc>
-          <w:tcPr>
-            <w:tcW w:type="dxa" w:w="2880"/>
-          </w:tcPr>
-          <w:p>
-            <w:r/>
-            <w:r>
-              <w:rPr>
-                <w:rFonts w:ascii="Arial" w:hAnsi="Arial"/>
-                <w:b w:val="0"/>
-                <w:color w:val="111111"/>
-                <w:sz w:val="18"/>
-              </w:rPr>
-              <w:t>Held for acute kidney injury. Restart is parameter-gated on a stable creatinine and volume status at outpatient follow-up.</w:t>
-            </w:r>
-          </w:p>
-        </w:tc>
-      </w:tr>
-      <w:tr>
-        <w:tc>
-          <w:tcPr>
-            <w:tcW w:type="dxa" w:w="2880"/>
-          </w:tcPr>
-          <w:p>
-            <w:r/>
-            <w:r>
-              <w:rPr>
-                <w:rFonts w:ascii="Arial" w:hAnsi="Arial"/>
-                <w:b w:val="0"/>
-                <w:color w:val="111111"/>
-                <w:sz w:val="18"/>
-              </w:rPr>
-              <w:t>Furosemide 20 mg Oral daily</w:t>
-            </w:r>
-          </w:p>
-        </w:tc>
-        <w:tc>
-          <w:tcPr>
-            <w:tcW w:type="dxa" w:w="2880"/>
-          </w:tcPr>
-          <w:p>
-            <w:r/>
-            <w:r>
-              <w:rPr>
-                <w:rFonts w:ascii="Arial" w:hAnsi="Arial"/>
-                <w:b w:val="0"/>
-                <w:color w:val="111111"/>
-                <w:sz w:val="18"/>
-              </w:rPr>
-              <w:t>Continue</w:t>
-            </w:r>
-          </w:p>
-        </w:tc>
-        <w:tc>
-          <w:tcPr>
-            <w:tcW w:type="dxa" w:w="2880"/>
-          </w:tcPr>
-          <w:p>
-            <w:r/>
-            <w:r>
-              <w:rPr>
-                <w:rFonts w:ascii="Arial" w:hAnsi="Arial"/>
-                <w:b w:val="0"/>
-                <w:color w:val="111111"/>
-                <w:sz w:val="18"/>
-              </w:rPr>
-              <w:t>Volume management, monitor.</w:t>
-            </w:r>
-          </w:p>
-        </w:tc>
-      </w:tr>
-      <w:tr>
-        <w:tc>
-          <w:tcPr>
-            <w:tcW w:type="dxa" w:w="2880"/>
-          </w:tcPr>
-          <w:p>
-            <w:r/>
-            <w:r>
-              <w:rPr>
-                <w:rFonts w:ascii="Arial" w:hAnsi="Arial"/>
-                <w:b w:val="0"/>
-                <w:color w:val="111111"/>
-                <w:sz w:val="18"/>
-              </w:rPr>
-              <w:t>Atorvastatin 40 mg Oral nightly</w:t>
-            </w:r>
-          </w:p>
-        </w:tc>
-        <w:tc>
-          <w:tcPr>
-            <w:tcW w:type="dxa" w:w="2880"/>
-          </w:tcPr>
-          <w:p>
-            <w:r/>
-            <w:r>
-              <w:rPr>
-                <w:rFonts w:ascii="Arial" w:hAnsi="Arial"/>
-                <w:b w:val="0"/>
-                <w:color w:val="111111"/>
-                <w:sz w:val="18"/>
-              </w:rPr>
-              <w:t>Continue</w:t>
-            </w:r>
-          </w:p>
-        </w:tc>
-        <w:tc>
-          <w:tcPr>
-            <w:tcW w:type="dxa" w:w="2880"/>
-          </w:tcPr>
-          <w:p>
-            <w:r/>
-            <w:r>
-              <w:rPr>
-                <w:rFonts w:ascii="Arial" w:hAnsi="Arial"/>
-                <w:b w:val="0"/>
-                <w:color w:val="111111"/>
-                <w:sz w:val="18"/>
-              </w:rPr>
-              <w:t>Secondary prevention.</w:t>
-            </w:r>
-          </w:p>
-        </w:tc>
-      </w:tr>
-      <w:tr>
-        <w:tc>
-          <w:tcPr>
-            <w:tcW w:type="dxa" w:w="2880"/>
-          </w:tcPr>
-          <w:p>
-            <w:r/>
-            <w:r>
-              <w:rPr>
-                <w:rFonts w:ascii="Arial" w:hAnsi="Arial"/>
-                <w:b w:val="0"/>
-                <w:color w:val="111111"/>
-                <w:sz w:val="18"/>
-              </w:rPr>
-              <w:t>Aspirin 81 mg Oral daily</w:t>
-            </w:r>
-          </w:p>
-        </w:tc>
-        <w:tc>
-          <w:tcPr>
-            <w:tcW w:type="dxa" w:w="2880"/>
-          </w:tcPr>
-          <w:p>
-            <w:r/>
-            <w:r>
-              <w:rPr>
-                <w:rFonts w:ascii="Arial" w:hAnsi="Arial"/>
-                <w:b w:val="0"/>
-                <w:color w:val="111111"/>
-                <w:sz w:val="18"/>
-              </w:rPr>
-              <w:t>Continue</w:t>
-            </w:r>
-          </w:p>
-        </w:tc>
-        <w:tc>
-          <w:tcPr>
-            <w:tcW w:type="dxa" w:w="2880"/>
-          </w:tcPr>
-          <w:p>
-            <w:r/>
-            <w:r>
-              <w:rPr>
-                <w:rFonts w:ascii="Arial" w:hAnsi="Arial"/>
-                <w:b w:val="0"/>
-                <w:color w:val="111111"/>
-                <w:sz w:val="18"/>
-              </w:rPr>
-              <w:t>Peripheral arterial disease, secondary prevention.</w:t>
-            </w:r>
-          </w:p>
-        </w:tc>
-      </w:tr>
-      <w:tr>
-        <w:tc>
-          <w:tcPr>
-            <w:tcW w:type="dxa" w:w="2880"/>
-          </w:tcPr>
-          <w:p>
-            <w:r/>
-            <w:r>
-              <w:rPr>
-                <w:rFonts w:ascii="Arial" w:hAnsi="Arial"/>
-                <w:b w:val="0"/>
-                <w:color w:val="111111"/>
-                <w:sz w:val="18"/>
-              </w:rPr>
-              <w:t>Clopidogrel 75 mg Oral daily</w:t>
-            </w:r>
-          </w:p>
-        </w:tc>
-        <w:tc>
-          <w:tcPr>
-            <w:tcW w:type="dxa" w:w="2880"/>
-          </w:tcPr>
-          <w:p>
-            <w:r/>
-            <w:r>
-              <w:rPr>
-                <w:rFonts w:ascii="Arial" w:hAnsi="Arial"/>
-                <w:b w:val="0"/>
-                <w:color w:val="111111"/>
-                <w:sz w:val="18"/>
-              </w:rPr>
-              <w:t>Continue</w:t>
-            </w:r>
-          </w:p>
-        </w:tc>
-        <w:tc>
-          <w:tcPr>
-            <w:tcW w:type="dxa" w:w="2880"/>
-          </w:tcPr>
-          <w:p>
-            <w:r/>
-            <w:r>
-              <w:rPr>
-                <w:rFonts w:ascii="Arial" w:hAnsi="Arial"/>
-                <w:b w:val="0"/>
-                <w:color w:val="111111"/>
-                <w:sz w:val="18"/>
-              </w:rPr>
-              <w:t>Peripheral arterial disease.</w:t>
-            </w:r>
-          </w:p>
-        </w:tc>
-      </w:tr>
-      <w:tr>
-        <w:tc>
-          <w:tcPr>
-            <w:tcW w:type="dxa" w:w="2880"/>
-          </w:tcPr>
-          <w:p>
-            <w:r/>
-            <w:r>
-              <w:rPr>
-                <w:rFonts w:ascii="Arial" w:hAnsi="Arial"/>
-                <w:b w:val="0"/>
-                <w:color w:val="111111"/>
-                <w:sz w:val="18"/>
-              </w:rPr>
-              <w:t>Gabapentin 300 mg Oral three times daily</w:t>
-            </w:r>
-          </w:p>
-        </w:tc>
-        <w:tc>
-          <w:tcPr>
-            <w:tcW w:type="dxa" w:w="2880"/>
-          </w:tcPr>
-          <w:p>
-            <w:r/>
-            <w:r>
-              <w:rPr>
-                <w:rFonts w:ascii="Arial" w:hAnsi="Arial"/>
-                <w:b w:val="0"/>
-                <w:color w:val="111111"/>
-                <w:sz w:val="18"/>
-              </w:rPr>
-              <w:t>Continue, renally dose-checked</w:t>
-            </w:r>
-          </w:p>
-        </w:tc>
-        <w:tc>
-          <w:tcPr>
-            <w:tcW w:type="dxa" w:w="2880"/>
-          </w:tcPr>
-          <w:p>
-            <w:r/>
-            <w:r>
-              <w:rPr>
-                <w:rFonts w:ascii="Arial" w:hAnsi="Arial"/>
-                <w:b w:val="0"/>
-                <w:color w:val="111111"/>
-                <w:sz w:val="18"/>
-              </w:rPr>
-              <w:t>Neuropathic pain, dose appropriate for current renal function.</w:t>
-            </w:r>
-          </w:p>
-        </w:tc>
-      </w:tr>
-      <w:tr>
-        <w:tc>
-          <w:tcPr>
-            <w:tcW w:type="dxa" w:w="2880"/>
-          </w:tcPr>
-          <w:p>
-            <w:r/>
-            <w:r>
-              <w:rPr>
-                <w:rFonts w:ascii="Arial" w:hAnsi="Arial"/>
-                <w:b w:val="0"/>
-                <w:color w:val="111111"/>
-                <w:sz w:val="18"/>
-              </w:rPr>
-              <w:t>Ferrous sulfate 325 mg Oral daily</w:t>
-            </w:r>
-          </w:p>
-        </w:tc>
-        <w:tc>
-          <w:tcPr>
-            <w:tcW w:type="dxa" w:w="2880"/>
-          </w:tcPr>
-          <w:p>
-            <w:r/>
-            <w:r>
-              <w:rPr>
-                <w:rFonts w:ascii="Arial" w:hAnsi="Arial"/>
-                <w:b w:val="0"/>
-                <w:color w:val="111111"/>
-                <w:sz w:val="18"/>
-              </w:rPr>
-              <w:t>Continue</w:t>
-            </w:r>
-          </w:p>
-        </w:tc>
-        <w:tc>
-          <w:tcPr>
-            <w:tcW w:type="dxa" w:w="2880"/>
-          </w:tcPr>
-          <w:p>
-            <w:r/>
-            <w:r>
-              <w:rPr>
-                <w:rFonts w:ascii="Arial" w:hAnsi="Arial"/>
-                <w:b w:val="0"/>
-                <w:color w:val="111111"/>
-                <w:sz w:val="18"/>
-              </w:rPr>
-              <w:t>Anemia of chronic kidney disease.</w:t>
-            </w:r>
-          </w:p>
-        </w:tc>
-      </w:tr>
-      <w:tr>
-        <w:tc>
-          <w:tcPr>
-            <w:tcW w:type="dxa" w:w="2880"/>
-          </w:tcPr>
-          <w:p>
-            <w:r/>
-            <w:r>
-              <w:rPr>
-                <w:rFonts w:ascii="Arial" w:hAnsi="Arial"/>
-                <w:b w:val="0"/>
-                <w:color w:val="111111"/>
-                <w:sz w:val="18"/>
-              </w:rPr>
-              <w:t>Cholecalciferol 2000 units Oral daily</w:t>
-            </w:r>
-          </w:p>
-        </w:tc>
-        <w:tc>
-          <w:tcPr>
-            <w:tcW w:type="dxa" w:w="2880"/>
-          </w:tcPr>
-          <w:p>
-            <w:r/>
-            <w:r>
-              <w:rPr>
-                <w:rFonts w:ascii="Arial" w:hAnsi="Arial"/>
-                <w:b w:val="0"/>
-                <w:color w:val="111111"/>
-                <w:sz w:val="18"/>
-              </w:rPr>
-              <w:t>Continue</w:t>
-            </w:r>
-          </w:p>
-        </w:tc>
-        <w:tc>
-          <w:tcPr>
-            <w:tcW w:type="dxa" w:w="2880"/>
-          </w:tcPr>
-          <w:p>
-            <w:r/>
-            <w:r>
-              <w:rPr>
-                <w:rFonts w:ascii="Arial" w:hAnsi="Arial"/>
-                <w:b w:val="0"/>
-                <w:color w:val="111111"/>
-                <w:sz w:val="18"/>
-              </w:rPr>
-              <w:t>Chronic kidney disease mineral and bone health.</w:t>
-            </w:r>
-          </w:p>
-        </w:tc>
-      </w:tr>
-      <w:tr>
-        <w:tc>
-          <w:tcPr>
-            <w:tcW w:type="dxa" w:w="2880"/>
-          </w:tcPr>
-          <w:p>
-            <w:r/>
-            <w:r>
-              <w:rPr>
-                <w:rFonts w:ascii="Arial" w:hAnsi="Arial"/>
-                <w:b w:val="0"/>
-                <w:color w:val="111111"/>
-                <w:sz w:val="18"/>
-              </w:rPr>
-              <w:t>Pantoprazole 40 mg Oral daily</w:t>
-            </w:r>
-          </w:p>
-        </w:tc>
-        <w:tc>
-          <w:tcPr>
-            <w:tcW w:type="dxa" w:w="2880"/>
-          </w:tcPr>
-          <w:p>
-            <w:r/>
-            <w:r>
-              <w:rPr>
-                <w:rFonts w:ascii="Arial" w:hAnsi="Arial"/>
-                <w:b w:val="0"/>
-                <w:color w:val="111111"/>
-                <w:sz w:val="18"/>
-              </w:rPr>
-              <w:t>Continue</w:t>
-            </w:r>
-          </w:p>
-        </w:tc>
-        <w:tc>
-          <w:tcPr>
-            <w:tcW w:type="dxa" w:w="2880"/>
-          </w:tcPr>
-          <w:p>
-            <w:r/>
-            <w:r>
-              <w:rPr>
-                <w:rFonts w:ascii="Arial" w:hAnsi="Arial"/>
-                <w:b w:val="0"/>
-                <w:color w:val="111111"/>
-                <w:sz w:val="18"/>
-              </w:rPr>
-              <w:t>GERD.</w:t>
-            </w:r>
-          </w:p>
-        </w:tc>
-      </w:tr>
-      <w:tr>
-        <w:tc>
-          <w:tcPr>
-            <w:tcW w:type="dxa" w:w="2880"/>
-          </w:tcPr>
-          <w:p>
-            <w:r/>
-            <w:r>
-              <w:rPr>
-                <w:rFonts w:ascii="Arial" w:hAnsi="Arial"/>
-                <w:b w:val="0"/>
-                <w:color w:val="111111"/>
-                <w:sz w:val="18"/>
-              </w:rPr>
-              <w:t>Acetaminophen 650 mg Oral three times daily as needed</w:t>
-            </w:r>
-          </w:p>
-        </w:tc>
-        <w:tc>
-          <w:tcPr>
-            <w:tcW w:type="dxa" w:w="2880"/>
-          </w:tcPr>
-          <w:p>
-            <w:r/>
-            <w:r>
-              <w:rPr>
-                <w:rFonts w:ascii="Arial" w:hAnsi="Arial"/>
-                <w:b w:val="0"/>
-                <w:color w:val="111111"/>
-                <w:sz w:val="18"/>
-              </w:rPr>
-              <w:t>Continue</w:t>
-            </w:r>
-          </w:p>
-        </w:tc>
-        <w:tc>
-          <w:tcPr>
-            <w:tcW w:type="dxa" w:w="2880"/>
-          </w:tcPr>
-          <w:p>
-            <w:r/>
-            <w:r>
-              <w:rPr>
-                <w:rFonts w:ascii="Arial" w:hAnsi="Arial"/>
-                <w:b w:val="0"/>
-                <w:color w:val="111111"/>
-                <w:sz w:val="18"/>
-              </w:rPr>
-              <w:t>Knee osteoarthritis. NSAIDs are avoided in chronic kidney disease stage 3b.</w:t>
-            </w:r>
-          </w:p>
-        </w:tc>
-      </w:tr>
-      <w:tr>
-        <w:tc>
-          <w:tcPr>
-            <w:tcW w:type="dxa" w:w="2880"/>
-          </w:tcPr>
-          <w:p>
-            <w:r/>
-            <w:r>
-              <w:rPr>
-                <w:rFonts w:ascii="Arial" w:hAnsi="Arial"/>
-                <w:b w:val="0"/>
-                <w:color w:val="111111"/>
-                <w:sz w:val="18"/>
-              </w:rPr>
-              <w:t>Discharge antibiotic, deep-tissue-culture directed, renally dosed</w:t>
-            </w:r>
-          </w:p>
-        </w:tc>
-        <w:tc>
-          <w:tcPr>
-            <w:tcW w:type="dxa" w:w="2880"/>
-          </w:tcPr>
-          <w:p>
-            <w:r/>
-            <w:r>
-              <w:rPr>
-                <w:rFonts w:ascii="Arial" w:hAnsi="Arial"/>
-                <w:b w:val="0"/>
-                <w:color w:val="111111"/>
-                <w:sz w:val="18"/>
-              </w:rPr>
-              <w:t>Continue at a renally correct dose per infectious disease</w:t>
-            </w:r>
-          </w:p>
-        </w:tc>
-        <w:tc>
-          <w:tcPr>
-            <w:tcW w:type="dxa" w:w="2880"/>
-          </w:tcPr>
-          <w:p>
-            <w:r/>
-            <w:r>
-              <w:rPr>
-                <w:rFonts w:ascii="Arial" w:hAnsi="Arial"/>
-                <w:b w:val="0"/>
-                <w:color w:val="111111"/>
-                <w:sz w:val="18"/>
-              </w:rPr>
-              <w:t>Directed by the deep-tissue culture, which outranks the superficial swab. Dose to the current eGFR. Do not carry the admission piperacillin-tazobactam 2.25 g Intravenous every 8 hours dose forward unchanged. Duration is not extended for osteomyelitis, which remains unconfirmed. Physician to confirm exact agent, route, and duration.</w:t>
+              <w:t>DISCHARGE MEDICATION RECONCILIATION</w:t>
             </w:r>
           </w:p>
         </w:tc>
@@ -934,21 +296,1232 @@
         <w:rPr>
           <w:rFonts w:ascii="Arial" w:hAnsi="Arial"/>
           <w:b/>
+          <w:i w:val="0"/>
           <w:color w:val="1F3864"/>
-          <w:sz w:val="22"/>
+          <w:sz w:val="28"/>
         </w:rPr>
-        <w:t>PATIENT INSTRUCTIONS (provide in Spanish)</w:t>
+        <w:t>DISCHARGE MEDICATION RECONCILIATION</w:t>
+      </w:r>
+    </w:p>
+    <w:p>
+      <w:r>
+        <w:rPr>
+          <w:rFonts w:ascii="Arial" w:hAnsi="Arial"/>
+          <w:b w:val="0"/>
+          <w:i w:val="0"/>
+          <w:color w:val="5E6670"/>
+          <w:sz w:val="16"/>
+        </w:rPr>
+        <w:t>Author: Marisol Everet, MD - Hospital Medicine | Date of Service: 05/22/2026 0830 | Status: Draft for physician sign</w:t>
+      </w:r>
+    </w:p>
+    <w:p>
+      <w:pPr>
+        <w:spacing w:before="180" w:after="60"/>
+        <w:pBdr>
+          <w:bottom w:val="single" w:sz="6" w:color="C9D4EA" w:space="2"/>
+        </w:pBdr>
+      </w:pPr>
+      <w:r>
+        <w:rPr>
+          <w:rFonts w:ascii="Arial" w:hAnsi="Arial"/>
+          <w:b/>
+          <w:i w:val="0"/>
+          <w:color w:val="4472C4"/>
+          <w:sz w:val="20"/>
+        </w:rPr>
+        <w:t>PATIENT / ENCOUNTER</w:t>
+      </w:r>
+    </w:p>
+    <w:p>
+      <w:r>
+        <w:rPr>
+          <w:rFonts w:ascii="Arial" w:hAnsi="Arial"/>
+          <w:b/>
+          <w:i w:val="0"/>
+          <w:color w:val="232830"/>
+          <w:sz w:val="18"/>
+        </w:rPr>
+        <w:t xml:space="preserve">Patient: </w:t>
+      </w:r>
+      <w:r>
+        <w:rPr>
+          <w:rFonts w:ascii="Arial" w:hAnsi="Arial"/>
+          <w:b w:val="0"/>
+          <w:i w:val="0"/>
+          <w:color w:val="232830"/>
+          <w:sz w:val="18"/>
+        </w:rPr>
+        <w:t>Ondina Vasquell, 68 y</w:t>
+      </w:r>
+    </w:p>
+    <w:p>
+      <w:r>
+        <w:rPr>
+          <w:rFonts w:ascii="Arial" w:hAnsi="Arial"/>
+          <w:b/>
+          <w:i w:val="0"/>
+          <w:color w:val="232830"/>
+          <w:sz w:val="18"/>
+        </w:rPr>
+        <w:t xml:space="preserve">Sex / DOB: </w:t>
+      </w:r>
+      <w:r>
+        <w:rPr>
+          <w:rFonts w:ascii="Arial" w:hAnsi="Arial"/>
+          <w:b w:val="0"/>
+          <w:i w:val="0"/>
+          <w:color w:val="232830"/>
+          <w:sz w:val="18"/>
+        </w:rPr>
+        <w:t>Female / 03/14/1958</w:t>
+      </w:r>
+    </w:p>
+    <w:p>
+      <w:r>
+        <w:rPr>
+          <w:rFonts w:ascii="Arial" w:hAnsi="Arial"/>
+          <w:b/>
+          <w:i w:val="0"/>
+          <w:color w:val="232830"/>
+          <w:sz w:val="18"/>
+        </w:rPr>
+        <w:t xml:space="preserve">MRN / FIN: </w:t>
+      </w:r>
+      <w:r>
+        <w:rPr>
+          <w:rFonts w:ascii="Arial" w:hAnsi="Arial"/>
+          <w:b w:val="0"/>
+          <w:i w:val="0"/>
+          <w:color w:val="232830"/>
+          <w:sz w:val="18"/>
+        </w:rPr>
+        <w:t>OV-3358104 / FIN-2207733</w:t>
+      </w:r>
+    </w:p>
+    <w:p>
+      <w:r>
+        <w:rPr>
+          <w:rFonts w:ascii="Arial" w:hAnsi="Arial"/>
+          <w:b/>
+          <w:i w:val="0"/>
+          <w:color w:val="232830"/>
+          <w:sz w:val="18"/>
+        </w:rPr>
+        <w:t xml:space="preserve">Unit / Room: </w:t>
+      </w:r>
+      <w:r>
+        <w:rPr>
+          <w:rFonts w:ascii="Arial" w:hAnsi="Arial"/>
+          <w:b w:val="0"/>
+          <w:i w:val="0"/>
+          <w:color w:val="232830"/>
+          <w:sz w:val="18"/>
+        </w:rPr>
+        <w:t>6 South Medicine / 6S-214</w:t>
+      </w:r>
+    </w:p>
+    <w:p>
+      <w:r>
+        <w:rPr>
+          <w:rFonts w:ascii="Arial" w:hAnsi="Arial"/>
+          <w:b/>
+          <w:i w:val="0"/>
+          <w:color w:val="232830"/>
+          <w:sz w:val="18"/>
+        </w:rPr>
+        <w:t xml:space="preserve">Code Status: </w:t>
+      </w:r>
+      <w:r>
+        <w:rPr>
+          <w:rFonts w:ascii="Arial" w:hAnsi="Arial"/>
+          <w:b w:val="0"/>
+          <w:i w:val="0"/>
+          <w:color w:val="232830"/>
+          <w:sz w:val="18"/>
+        </w:rPr>
+        <w:t>Full Code</w:t>
+      </w:r>
+    </w:p>
+    <w:p>
+      <w:r>
+        <w:rPr>
+          <w:rFonts w:ascii="Arial" w:hAnsi="Arial"/>
+          <w:b/>
+          <w:i w:val="0"/>
+          <w:color w:val="232830"/>
+          <w:sz w:val="18"/>
+        </w:rPr>
+        <w:t xml:space="preserve">Allergies: </w:t>
+      </w:r>
+      <w:r>
+        <w:rPr>
+          <w:rFonts w:ascii="Arial" w:hAnsi="Arial"/>
+          <w:b w:val="0"/>
+          <w:i w:val="0"/>
+          <w:color w:val="232830"/>
+          <w:sz w:val="18"/>
+        </w:rPr>
+        <w:t>Sulfa (sulfonamide antibiotics) - rash</w:t>
+      </w:r>
+    </w:p>
+    <w:p>
+      <w:r>
+        <w:rPr>
+          <w:rFonts w:ascii="Arial" w:hAnsi="Arial"/>
+          <w:b/>
+          <w:i w:val="0"/>
+          <w:color w:val="232830"/>
+          <w:sz w:val="18"/>
+        </w:rPr>
+        <w:t xml:space="preserve">Attending: </w:t>
+      </w:r>
+      <w:r>
+        <w:rPr>
+          <w:rFonts w:ascii="Arial" w:hAnsi="Arial"/>
+          <w:b w:val="0"/>
+          <w:i w:val="0"/>
+          <w:color w:val="232830"/>
+          <w:sz w:val="18"/>
+        </w:rPr>
+        <w:t>Marisol Everet, MD</w:t>
+      </w:r>
+    </w:p>
+    <w:p>
+      <w:r>
+        <w:rPr>
+          <w:rFonts w:ascii="Arial" w:hAnsi="Arial"/>
+          <w:b/>
+          <w:i w:val="0"/>
+          <w:color w:val="232830"/>
+          <w:sz w:val="18"/>
+        </w:rPr>
+        <w:t xml:space="preserve">Service: </w:t>
+      </w:r>
+      <w:r>
+        <w:rPr>
+          <w:rFonts w:ascii="Arial" w:hAnsi="Arial"/>
+          <w:b w:val="0"/>
+          <w:i w:val="0"/>
+          <w:color w:val="232830"/>
+          <w:sz w:val="18"/>
+        </w:rPr>
+        <w:t>Hospital Medicine</w:t>
+      </w:r>
+    </w:p>
+    <w:p>
+      <w:r>
+        <w:rPr>
+          <w:rFonts w:ascii="Arial" w:hAnsi="Arial"/>
+          <w:b/>
+          <w:i w:val="0"/>
+          <w:color w:val="232830"/>
+          <w:sz w:val="18"/>
+        </w:rPr>
+        <w:t xml:space="preserve">Date of Service: </w:t>
+      </w:r>
+      <w:r>
+        <w:rPr>
+          <w:rFonts w:ascii="Arial" w:hAnsi="Arial"/>
+          <w:b w:val="0"/>
+          <w:i w:val="0"/>
+          <w:color w:val="232830"/>
+          <w:sz w:val="18"/>
+        </w:rPr>
+        <w:t>05/22/2026</w:t>
+      </w:r>
+    </w:p>
+    <w:p>
+      <w:r>
+        <w:rPr>
+          <w:rFonts w:ascii="Arial" w:hAnsi="Arial"/>
+          <w:b/>
+          <w:i w:val="0"/>
+          <w:color w:val="232830"/>
+          <w:sz w:val="18"/>
+        </w:rPr>
+        <w:t xml:space="preserve">Language: </w:t>
+      </w:r>
+      <w:r>
+        <w:rPr>
+          <w:rFonts w:ascii="Arial" w:hAnsi="Arial"/>
+          <w:b w:val="0"/>
+          <w:i w:val="0"/>
+          <w:color w:val="232830"/>
+          <w:sz w:val="18"/>
+        </w:rPr>
+        <w:t>Spanish preferred (interpreter used)</w:t>
+      </w:r>
+    </w:p>
+    <w:p>
+      <w:pPr>
+        <w:spacing w:before="180" w:after="60"/>
+        <w:pBdr>
+          <w:bottom w:val="single" w:sz="6" w:color="C9D4EA" w:space="2"/>
+        </w:pBdr>
+      </w:pPr>
+      <w:r>
+        <w:rPr>
+          <w:rFonts w:ascii="Arial" w:hAnsi="Arial"/>
+          <w:b/>
+          <w:i w:val="0"/>
+          <w:color w:val="4472C4"/>
+          <w:sz w:val="20"/>
+        </w:rPr>
+        <w:t>SOURCES REVIEWED</w:t>
+      </w:r>
+    </w:p>
+    <w:p>
+      <w:r>
+        <w:rPr>
+          <w:rFonts w:ascii="Arial" w:hAnsi="Arial"/>
+          <w:b w:val="0"/>
+          <w:i w:val="0"/>
+          <w:color w:val="232830"/>
+          <w:sz w:val="19"/>
+        </w:rPr>
+        <w:t>Home medication list, medication administration record, admission medication-hold orders, renal function trend, infectious disease notes, and the preliminary unreconciled discharge order set.</w:t>
+      </w:r>
+    </w:p>
+    <w:p>
+      <w:pPr>
+        <w:spacing w:before="180" w:after="60"/>
+        <w:pBdr>
+          <w:bottom w:val="single" w:sz="6" w:color="C9D4EA" w:space="2"/>
+        </w:pBdr>
+      </w:pPr>
+      <w:r>
+        <w:rPr>
+          <w:rFonts w:ascii="Arial" w:hAnsi="Arial"/>
+          <w:b/>
+          <w:i w:val="0"/>
+          <w:color w:val="4472C4"/>
+          <w:sz w:val="20"/>
+        </w:rPr>
+        <w:t>RECONCILED MEDICATIONS</w:t>
+      </w:r>
+    </w:p>
+    <w:tbl>
+      <w:tblPr>
+        <w:tblW w:type="auto" w:w="0"/>
+        <w:tblLook w:firstColumn="1" w:firstRow="1" w:lastColumn="0" w:lastRow="0" w:noHBand="0" w:noVBand="1" w:val="04A0"/>
+        <w:tblBorders>
+          <w:top w:val="single" w:sz="4" w:color="C9D4EA"/>
+          <w:left w:val="single" w:sz="4" w:color="C9D4EA"/>
+          <w:bottom w:val="single" w:sz="4" w:color="C9D4EA"/>
+          <w:right w:val="single" w:sz="4" w:color="C9D4EA"/>
+          <w:insideH w:val="single" w:sz="4" w:color="C9D4EA"/>
+          <w:insideV w:val="single" w:sz="4" w:color="C9D4EA"/>
+        </w:tblBorders>
+      </w:tblPr>
+      <w:tblGrid>
+        <w:gridCol w:w="3456"/>
+        <w:gridCol w:w="3456"/>
+        <w:gridCol w:w="3456"/>
+      </w:tblGrid>
+      <w:tr>
+        <w:tc>
+          <w:tcPr>
+            <w:tcW w:type="dxa" w:w="3456"/>
+            <w:shd w:val="clear" w:fill="4472C4"/>
+          </w:tcPr>
+          <w:p>
+            <w:r>
+              <w:rPr>
+                <w:rFonts w:ascii="Arial" w:hAnsi="Arial"/>
+                <w:b/>
+                <w:i w:val="0"/>
+                <w:color w:val="FFFFFF"/>
+                <w:sz w:val="16"/>
+              </w:rPr>
+              <w:t>Medication</w:t>
+            </w:r>
+          </w:p>
+        </w:tc>
+        <w:tc>
+          <w:tcPr>
+            <w:tcW w:type="dxa" w:w="3456"/>
+            <w:shd w:val="clear" w:fill="4472C4"/>
+          </w:tcPr>
+          <w:p>
+            <w:r>
+              <w:rPr>
+                <w:rFonts w:ascii="Arial" w:hAnsi="Arial"/>
+                <w:b/>
+                <w:i w:val="0"/>
+                <w:color w:val="FFFFFF"/>
+                <w:sz w:val="16"/>
+              </w:rPr>
+              <w:t>Disposition</w:t>
+            </w:r>
+          </w:p>
+        </w:tc>
+        <w:tc>
+          <w:tcPr>
+            <w:tcW w:type="dxa" w:w="3456"/>
+            <w:shd w:val="clear" w:fill="4472C4"/>
+          </w:tcPr>
+          <w:p>
+            <w:r>
+              <w:rPr>
+                <w:rFonts w:ascii="Arial" w:hAnsi="Arial"/>
+                <w:b/>
+                <w:i w:val="0"/>
+                <w:color w:val="FFFFFF"/>
+                <w:sz w:val="16"/>
+              </w:rPr>
+              <w:t>Rationale</w:t>
+            </w:r>
+          </w:p>
+        </w:tc>
+      </w:tr>
+      <w:tr>
+        <w:tc>
+          <w:tcPr>
+            <w:tcW w:type="dxa" w:w="3456"/>
+          </w:tcPr>
+          <w:p>
+            <w:r>
+              <w:rPr>
+                <w:rFonts w:ascii="Arial" w:hAnsi="Arial"/>
+                <w:b w:val="0"/>
+                <w:i w:val="0"/>
+                <w:color w:val="232830"/>
+                <w:sz w:val="16"/>
+              </w:rPr>
+              <w:t>Insulin glargine 26 units Subcutaneous nightly</w:t>
+            </w:r>
+          </w:p>
+        </w:tc>
+        <w:tc>
+          <w:tcPr>
+            <w:tcW w:type="dxa" w:w="3456"/>
+          </w:tcPr>
+          <w:p>
+            <w:r>
+              <w:rPr>
+                <w:rFonts w:ascii="Arial" w:hAnsi="Arial"/>
+                <w:b w:val="0"/>
+                <w:i w:val="0"/>
+                <w:color w:val="232830"/>
+                <w:sz w:val="16"/>
+              </w:rPr>
+              <w:t>Continue, adjust to intake</w:t>
+            </w:r>
+          </w:p>
+        </w:tc>
+        <w:tc>
+          <w:tcPr>
+            <w:tcW w:type="dxa" w:w="3456"/>
+          </w:tcPr>
+          <w:p>
+            <w:r>
+              <w:rPr>
+                <w:rFonts w:ascii="Arial" w:hAnsi="Arial"/>
+                <w:b w:val="0"/>
+                <w:i w:val="0"/>
+                <w:color w:val="232830"/>
+                <w:sz w:val="16"/>
+              </w:rPr>
+              <w:t>Home basal insulin, continued through the stay.</w:t>
+            </w:r>
+          </w:p>
+        </w:tc>
+      </w:tr>
+      <w:tr>
+        <w:tc>
+          <w:tcPr>
+            <w:tcW w:type="dxa" w:w="3456"/>
+            <w:shd w:val="clear" w:fill="EDF2FA"/>
+          </w:tcPr>
+          <w:p>
+            <w:r>
+              <w:rPr>
+                <w:rFonts w:ascii="Arial" w:hAnsi="Arial"/>
+                <w:b w:val="0"/>
+                <w:i w:val="0"/>
+                <w:color w:val="232830"/>
+                <w:sz w:val="16"/>
+              </w:rPr>
+              <w:t>Insulin aspart sliding scale Subcutaneous with meals</w:t>
+            </w:r>
+          </w:p>
+        </w:tc>
+        <w:tc>
+          <w:tcPr>
+            <w:tcW w:type="dxa" w:w="3456"/>
+            <w:shd w:val="clear" w:fill="EDF2FA"/>
+          </w:tcPr>
+          <w:p>
+            <w:r>
+              <w:rPr>
+                <w:rFonts w:ascii="Arial" w:hAnsi="Arial"/>
+                <w:b w:val="0"/>
+                <w:i w:val="0"/>
+                <w:color w:val="232830"/>
+                <w:sz w:val="16"/>
+              </w:rPr>
+              <w:t>Continue</w:t>
+            </w:r>
+          </w:p>
+        </w:tc>
+        <w:tc>
+          <w:tcPr>
+            <w:tcW w:type="dxa" w:w="3456"/>
+            <w:shd w:val="clear" w:fill="EDF2FA"/>
+          </w:tcPr>
+          <w:p>
+            <w:r>
+              <w:rPr>
+                <w:rFonts w:ascii="Arial" w:hAnsi="Arial"/>
+                <w:b w:val="0"/>
+                <w:i w:val="0"/>
+                <w:color w:val="232830"/>
+                <w:sz w:val="16"/>
+              </w:rPr>
+              <w:t>Prandial coverage, no change indicated.</w:t>
+            </w:r>
+          </w:p>
+        </w:tc>
+      </w:tr>
+      <w:tr>
+        <w:tc>
+          <w:tcPr>
+            <w:tcW w:type="dxa" w:w="3456"/>
+          </w:tcPr>
+          <w:p>
+            <w:r>
+              <w:rPr>
+                <w:rFonts w:ascii="Arial" w:hAnsi="Arial"/>
+                <w:b w:val="0"/>
+                <w:i w:val="0"/>
+                <w:color w:val="232830"/>
+                <w:sz w:val="16"/>
+              </w:rPr>
+              <w:t>Metformin 500 mg Oral twice daily</w:t>
+            </w:r>
+          </w:p>
+        </w:tc>
+        <w:tc>
+          <w:tcPr>
+            <w:tcW w:type="dxa" w:w="3456"/>
+          </w:tcPr>
+          <w:p>
+            <w:r>
+              <w:rPr>
+                <w:rFonts w:ascii="Arial" w:hAnsi="Arial"/>
+                <w:b w:val="0"/>
+                <w:i w:val="0"/>
+                <w:color w:val="232830"/>
+                <w:sz w:val="16"/>
+              </w:rPr>
+              <w:t>Defer restart, remains held</w:t>
+            </w:r>
+          </w:p>
+        </w:tc>
+        <w:tc>
+          <w:tcPr>
+            <w:tcW w:type="dxa" w:w="3456"/>
+          </w:tcPr>
+          <w:p>
+            <w:r>
+              <w:rPr>
+                <w:rFonts w:ascii="Arial" w:hAnsi="Arial"/>
+                <w:b w:val="0"/>
+                <w:i w:val="0"/>
+                <w:color w:val="232830"/>
+                <w:sz w:val="16"/>
+              </w:rPr>
+              <w:t>Held for acute kidney injury on chronic kidney disease, eGFR in the 30s near the metformin threshold. Resume only after renal function is confirmed stable as an outpatient. Do not resume at discharge.</w:t>
+            </w:r>
+          </w:p>
+        </w:tc>
+      </w:tr>
+      <w:tr>
+        <w:tc>
+          <w:tcPr>
+            <w:tcW w:type="dxa" w:w="3456"/>
+            <w:shd w:val="clear" w:fill="EDF2FA"/>
+          </w:tcPr>
+          <w:p>
+            <w:r>
+              <w:rPr>
+                <w:rFonts w:ascii="Arial" w:hAnsi="Arial"/>
+                <w:b w:val="0"/>
+                <w:i w:val="0"/>
+                <w:color w:val="232830"/>
+                <w:sz w:val="16"/>
+              </w:rPr>
+              <w:t>Empagliflozin 10 mg Oral daily</w:t>
+            </w:r>
+          </w:p>
+        </w:tc>
+        <w:tc>
+          <w:tcPr>
+            <w:tcW w:type="dxa" w:w="3456"/>
+            <w:shd w:val="clear" w:fill="EDF2FA"/>
+          </w:tcPr>
+          <w:p>
+            <w:r>
+              <w:rPr>
+                <w:rFonts w:ascii="Arial" w:hAnsi="Arial"/>
+                <w:b w:val="0"/>
+                <w:i w:val="0"/>
+                <w:color w:val="232830"/>
+                <w:sz w:val="16"/>
+              </w:rPr>
+              <w:t>Defer restart, remains held</w:t>
+            </w:r>
+          </w:p>
+        </w:tc>
+        <w:tc>
+          <w:tcPr>
+            <w:tcW w:type="dxa" w:w="3456"/>
+            <w:shd w:val="clear" w:fill="EDF2FA"/>
+          </w:tcPr>
+          <w:p>
+            <w:r>
+              <w:rPr>
+                <w:rFonts w:ascii="Arial" w:hAnsi="Arial"/>
+                <w:b w:val="0"/>
+                <w:i w:val="0"/>
+                <w:color w:val="232830"/>
+                <w:sz w:val="16"/>
+              </w:rPr>
+              <w:t>Held during acute infection for sick-day and euglycemic ketoacidosis risk. Resume as an outpatient once the acute illness has resolved and intake is reliable.</w:t>
+            </w:r>
+          </w:p>
+        </w:tc>
+      </w:tr>
+      <w:tr>
+        <w:tc>
+          <w:tcPr>
+            <w:tcW w:type="dxa" w:w="3456"/>
+          </w:tcPr>
+          <w:p>
+            <w:r>
+              <w:rPr>
+                <w:rFonts w:ascii="Arial" w:hAnsi="Arial"/>
+                <w:b w:val="0"/>
+                <w:i w:val="0"/>
+                <w:color w:val="232830"/>
+                <w:sz w:val="16"/>
+              </w:rPr>
+              <w:t>Lisinopril 20 mg Oral daily</w:t>
+            </w:r>
+          </w:p>
+        </w:tc>
+        <w:tc>
+          <w:tcPr>
+            <w:tcW w:type="dxa" w:w="3456"/>
+          </w:tcPr>
+          <w:p>
+            <w:r>
+              <w:rPr>
+                <w:rFonts w:ascii="Arial" w:hAnsi="Arial"/>
+                <w:b w:val="0"/>
+                <w:i w:val="0"/>
+                <w:color w:val="232830"/>
+                <w:sz w:val="16"/>
+              </w:rPr>
+              <w:t>Defer restart, remains held</w:t>
+            </w:r>
+          </w:p>
+        </w:tc>
+        <w:tc>
+          <w:tcPr>
+            <w:tcW w:type="dxa" w:w="3456"/>
+          </w:tcPr>
+          <w:p>
+            <w:r>
+              <w:rPr>
+                <w:rFonts w:ascii="Arial" w:hAnsi="Arial"/>
+                <w:b w:val="0"/>
+                <w:i w:val="0"/>
+                <w:color w:val="232830"/>
+                <w:sz w:val="16"/>
+              </w:rPr>
+              <w:t>Held for acute kidney injury. Restart is parameter-gated on a stable creatinine and volume status at outpatient follow-up.</w:t>
+            </w:r>
+          </w:p>
+        </w:tc>
+      </w:tr>
+      <w:tr>
+        <w:tc>
+          <w:tcPr>
+            <w:tcW w:type="dxa" w:w="3456"/>
+            <w:shd w:val="clear" w:fill="EDF2FA"/>
+          </w:tcPr>
+          <w:p>
+            <w:r>
+              <w:rPr>
+                <w:rFonts w:ascii="Arial" w:hAnsi="Arial"/>
+                <w:b w:val="0"/>
+                <w:i w:val="0"/>
+                <w:color w:val="232830"/>
+                <w:sz w:val="16"/>
+              </w:rPr>
+              <w:t>Furosemide 20 mg Oral daily</w:t>
+            </w:r>
+          </w:p>
+        </w:tc>
+        <w:tc>
+          <w:tcPr>
+            <w:tcW w:type="dxa" w:w="3456"/>
+            <w:shd w:val="clear" w:fill="EDF2FA"/>
+          </w:tcPr>
+          <w:p>
+            <w:r>
+              <w:rPr>
+                <w:rFonts w:ascii="Arial" w:hAnsi="Arial"/>
+                <w:b w:val="0"/>
+                <w:i w:val="0"/>
+                <w:color w:val="232830"/>
+                <w:sz w:val="16"/>
+              </w:rPr>
+              <w:t>Continue</w:t>
+            </w:r>
+          </w:p>
+        </w:tc>
+        <w:tc>
+          <w:tcPr>
+            <w:tcW w:type="dxa" w:w="3456"/>
+            <w:shd w:val="clear" w:fill="EDF2FA"/>
+          </w:tcPr>
+          <w:p>
+            <w:r>
+              <w:rPr>
+                <w:rFonts w:ascii="Arial" w:hAnsi="Arial"/>
+                <w:b w:val="0"/>
+                <w:i w:val="0"/>
+                <w:color w:val="232830"/>
+                <w:sz w:val="16"/>
+              </w:rPr>
+              <w:t>Volume management, monitor.</w:t>
+            </w:r>
+          </w:p>
+        </w:tc>
+      </w:tr>
+      <w:tr>
+        <w:tc>
+          <w:tcPr>
+            <w:tcW w:type="dxa" w:w="3456"/>
+          </w:tcPr>
+          <w:p>
+            <w:r>
+              <w:rPr>
+                <w:rFonts w:ascii="Arial" w:hAnsi="Arial"/>
+                <w:b w:val="0"/>
+                <w:i w:val="0"/>
+                <w:color w:val="232830"/>
+                <w:sz w:val="16"/>
+              </w:rPr>
+              <w:t>Atorvastatin 40 mg Oral nightly</w:t>
+            </w:r>
+          </w:p>
+        </w:tc>
+        <w:tc>
+          <w:tcPr>
+            <w:tcW w:type="dxa" w:w="3456"/>
+          </w:tcPr>
+          <w:p>
+            <w:r>
+              <w:rPr>
+                <w:rFonts w:ascii="Arial" w:hAnsi="Arial"/>
+                <w:b w:val="0"/>
+                <w:i w:val="0"/>
+                <w:color w:val="232830"/>
+                <w:sz w:val="16"/>
+              </w:rPr>
+              <w:t>Continue</w:t>
+            </w:r>
+          </w:p>
+        </w:tc>
+        <w:tc>
+          <w:tcPr>
+            <w:tcW w:type="dxa" w:w="3456"/>
+          </w:tcPr>
+          <w:p>
+            <w:r>
+              <w:rPr>
+                <w:rFonts w:ascii="Arial" w:hAnsi="Arial"/>
+                <w:b w:val="0"/>
+                <w:i w:val="0"/>
+                <w:color w:val="232830"/>
+                <w:sz w:val="16"/>
+              </w:rPr>
+              <w:t>Secondary prevention.</w:t>
+            </w:r>
+          </w:p>
+        </w:tc>
+      </w:tr>
+      <w:tr>
+        <w:tc>
+          <w:tcPr>
+            <w:tcW w:type="dxa" w:w="3456"/>
+            <w:shd w:val="clear" w:fill="EDF2FA"/>
+          </w:tcPr>
+          <w:p>
+            <w:r>
+              <w:rPr>
+                <w:rFonts w:ascii="Arial" w:hAnsi="Arial"/>
+                <w:b w:val="0"/>
+                <w:i w:val="0"/>
+                <w:color w:val="232830"/>
+                <w:sz w:val="16"/>
+              </w:rPr>
+              <w:t>Aspirin 81 mg Oral daily</w:t>
+            </w:r>
+          </w:p>
+        </w:tc>
+        <w:tc>
+          <w:tcPr>
+            <w:tcW w:type="dxa" w:w="3456"/>
+            <w:shd w:val="clear" w:fill="EDF2FA"/>
+          </w:tcPr>
+          <w:p>
+            <w:r>
+              <w:rPr>
+                <w:rFonts w:ascii="Arial" w:hAnsi="Arial"/>
+                <w:b w:val="0"/>
+                <w:i w:val="0"/>
+                <w:color w:val="232830"/>
+                <w:sz w:val="16"/>
+              </w:rPr>
+              <w:t>Continue</w:t>
+            </w:r>
+          </w:p>
+        </w:tc>
+        <w:tc>
+          <w:tcPr>
+            <w:tcW w:type="dxa" w:w="3456"/>
+            <w:shd w:val="clear" w:fill="EDF2FA"/>
+          </w:tcPr>
+          <w:p>
+            <w:r>
+              <w:rPr>
+                <w:rFonts w:ascii="Arial" w:hAnsi="Arial"/>
+                <w:b w:val="0"/>
+                <w:i w:val="0"/>
+                <w:color w:val="232830"/>
+                <w:sz w:val="16"/>
+              </w:rPr>
+              <w:t>Peripheral arterial disease, secondary prevention.</w:t>
+            </w:r>
+          </w:p>
+        </w:tc>
+      </w:tr>
+      <w:tr>
+        <w:tc>
+          <w:tcPr>
+            <w:tcW w:type="dxa" w:w="3456"/>
+          </w:tcPr>
+          <w:p>
+            <w:r>
+              <w:rPr>
+                <w:rFonts w:ascii="Arial" w:hAnsi="Arial"/>
+                <w:b w:val="0"/>
+                <w:i w:val="0"/>
+                <w:color w:val="232830"/>
+                <w:sz w:val="16"/>
+              </w:rPr>
+              <w:t>Clopidogrel 75 mg Oral daily</w:t>
+            </w:r>
+          </w:p>
+        </w:tc>
+        <w:tc>
+          <w:tcPr>
+            <w:tcW w:type="dxa" w:w="3456"/>
+          </w:tcPr>
+          <w:p>
+            <w:r>
+              <w:rPr>
+                <w:rFonts w:ascii="Arial" w:hAnsi="Arial"/>
+                <w:b w:val="0"/>
+                <w:i w:val="0"/>
+                <w:color w:val="232830"/>
+                <w:sz w:val="16"/>
+              </w:rPr>
+              <w:t>Continue</w:t>
+            </w:r>
+          </w:p>
+        </w:tc>
+        <w:tc>
+          <w:tcPr>
+            <w:tcW w:type="dxa" w:w="3456"/>
+          </w:tcPr>
+          <w:p>
+            <w:r>
+              <w:rPr>
+                <w:rFonts w:ascii="Arial" w:hAnsi="Arial"/>
+                <w:b w:val="0"/>
+                <w:i w:val="0"/>
+                <w:color w:val="232830"/>
+                <w:sz w:val="16"/>
+              </w:rPr>
+              <w:t>Peripheral arterial disease.</w:t>
+            </w:r>
+          </w:p>
+        </w:tc>
+      </w:tr>
+      <w:tr>
+        <w:tc>
+          <w:tcPr>
+            <w:tcW w:type="dxa" w:w="3456"/>
+            <w:shd w:val="clear" w:fill="EDF2FA"/>
+          </w:tcPr>
+          <w:p>
+            <w:r>
+              <w:rPr>
+                <w:rFonts w:ascii="Arial" w:hAnsi="Arial"/>
+                <w:b w:val="0"/>
+                <w:i w:val="0"/>
+                <w:color w:val="232830"/>
+                <w:sz w:val="16"/>
+              </w:rPr>
+              <w:t>Gabapentin 300 mg Oral three times daily</w:t>
+            </w:r>
+          </w:p>
+        </w:tc>
+        <w:tc>
+          <w:tcPr>
+            <w:tcW w:type="dxa" w:w="3456"/>
+            <w:shd w:val="clear" w:fill="EDF2FA"/>
+          </w:tcPr>
+          <w:p>
+            <w:r>
+              <w:rPr>
+                <w:rFonts w:ascii="Arial" w:hAnsi="Arial"/>
+                <w:b w:val="0"/>
+                <w:i w:val="0"/>
+                <w:color w:val="232830"/>
+                <w:sz w:val="16"/>
+              </w:rPr>
+              <w:t>Continue, renally dose-checked</w:t>
+            </w:r>
+          </w:p>
+        </w:tc>
+        <w:tc>
+          <w:tcPr>
+            <w:tcW w:type="dxa" w:w="3456"/>
+            <w:shd w:val="clear" w:fill="EDF2FA"/>
+          </w:tcPr>
+          <w:p>
+            <w:r>
+              <w:rPr>
+                <w:rFonts w:ascii="Arial" w:hAnsi="Arial"/>
+                <w:b w:val="0"/>
+                <w:i w:val="0"/>
+                <w:color w:val="232830"/>
+                <w:sz w:val="16"/>
+              </w:rPr>
+              <w:t>Neuropathic pain, dose appropriate for current renal function.</w:t>
+            </w:r>
+          </w:p>
+        </w:tc>
+      </w:tr>
+      <w:tr>
+        <w:tc>
+          <w:tcPr>
+            <w:tcW w:type="dxa" w:w="3456"/>
+          </w:tcPr>
+          <w:p>
+            <w:r>
+              <w:rPr>
+                <w:rFonts w:ascii="Arial" w:hAnsi="Arial"/>
+                <w:b w:val="0"/>
+                <w:i w:val="0"/>
+                <w:color w:val="232830"/>
+                <w:sz w:val="16"/>
+              </w:rPr>
+              <w:t>Ferrous sulfate 325 mg Oral daily</w:t>
+            </w:r>
+          </w:p>
+        </w:tc>
+        <w:tc>
+          <w:tcPr>
+            <w:tcW w:type="dxa" w:w="3456"/>
+          </w:tcPr>
+          <w:p>
+            <w:r>
+              <w:rPr>
+                <w:rFonts w:ascii="Arial" w:hAnsi="Arial"/>
+                <w:b w:val="0"/>
+                <w:i w:val="0"/>
+                <w:color w:val="232830"/>
+                <w:sz w:val="16"/>
+              </w:rPr>
+              <w:t>Continue</w:t>
+            </w:r>
+          </w:p>
+        </w:tc>
+        <w:tc>
+          <w:tcPr>
+            <w:tcW w:type="dxa" w:w="3456"/>
+          </w:tcPr>
+          <w:p>
+            <w:r>
+              <w:rPr>
+                <w:rFonts w:ascii="Arial" w:hAnsi="Arial"/>
+                <w:b w:val="0"/>
+                <w:i w:val="0"/>
+                <w:color w:val="232830"/>
+                <w:sz w:val="16"/>
+              </w:rPr>
+              <w:t>Anemia of chronic kidney disease.</w:t>
+            </w:r>
+          </w:p>
+        </w:tc>
+      </w:tr>
+      <w:tr>
+        <w:tc>
+          <w:tcPr>
+            <w:tcW w:type="dxa" w:w="3456"/>
+            <w:shd w:val="clear" w:fill="EDF2FA"/>
+          </w:tcPr>
+          <w:p>
+            <w:r>
+              <w:rPr>
+                <w:rFonts w:ascii="Arial" w:hAnsi="Arial"/>
+                <w:b w:val="0"/>
+                <w:i w:val="0"/>
+                <w:color w:val="232830"/>
+                <w:sz w:val="16"/>
+              </w:rPr>
+              <w:t>Cholecalciferol 2000 units Oral daily</w:t>
+            </w:r>
+          </w:p>
+        </w:tc>
+        <w:tc>
+          <w:tcPr>
+            <w:tcW w:type="dxa" w:w="3456"/>
+            <w:shd w:val="clear" w:fill="EDF2FA"/>
+          </w:tcPr>
+          <w:p>
+            <w:r>
+              <w:rPr>
+                <w:rFonts w:ascii="Arial" w:hAnsi="Arial"/>
+                <w:b w:val="0"/>
+                <w:i w:val="0"/>
+                <w:color w:val="232830"/>
+                <w:sz w:val="16"/>
+              </w:rPr>
+              <w:t>Continue</w:t>
+            </w:r>
+          </w:p>
+        </w:tc>
+        <w:tc>
+          <w:tcPr>
+            <w:tcW w:type="dxa" w:w="3456"/>
+            <w:shd w:val="clear" w:fill="EDF2FA"/>
+          </w:tcPr>
+          <w:p>
+            <w:r>
+              <w:rPr>
+                <w:rFonts w:ascii="Arial" w:hAnsi="Arial"/>
+                <w:b w:val="0"/>
+                <w:i w:val="0"/>
+                <w:color w:val="232830"/>
+                <w:sz w:val="16"/>
+              </w:rPr>
+              <w:t>Chronic kidney disease mineral and bone health.</w:t>
+            </w:r>
+          </w:p>
+        </w:tc>
+      </w:tr>
+      <w:tr>
+        <w:tc>
+          <w:tcPr>
+            <w:tcW w:type="dxa" w:w="3456"/>
+          </w:tcPr>
+          <w:p>
+            <w:r>
+              <w:rPr>
+                <w:rFonts w:ascii="Arial" w:hAnsi="Arial"/>
+                <w:b w:val="0"/>
+                <w:i w:val="0"/>
+                <w:color w:val="232830"/>
+                <w:sz w:val="16"/>
+              </w:rPr>
+              <w:t>Pantoprazole 40 mg Oral daily</w:t>
+            </w:r>
+          </w:p>
+        </w:tc>
+        <w:tc>
+          <w:tcPr>
+            <w:tcW w:type="dxa" w:w="3456"/>
+          </w:tcPr>
+          <w:p>
+            <w:r>
+              <w:rPr>
+                <w:rFonts w:ascii="Arial" w:hAnsi="Arial"/>
+                <w:b w:val="0"/>
+                <w:i w:val="0"/>
+                <w:color w:val="232830"/>
+                <w:sz w:val="16"/>
+              </w:rPr>
+              <w:t>Continue</w:t>
+            </w:r>
+          </w:p>
+        </w:tc>
+        <w:tc>
+          <w:tcPr>
+            <w:tcW w:type="dxa" w:w="3456"/>
+          </w:tcPr>
+          <w:p>
+            <w:r>
+              <w:rPr>
+                <w:rFonts w:ascii="Arial" w:hAnsi="Arial"/>
+                <w:b w:val="0"/>
+                <w:i w:val="0"/>
+                <w:color w:val="232830"/>
+                <w:sz w:val="16"/>
+              </w:rPr>
+              <w:t>GERD.</w:t>
+            </w:r>
+          </w:p>
+        </w:tc>
+      </w:tr>
+      <w:tr>
+        <w:tc>
+          <w:tcPr>
+            <w:tcW w:type="dxa" w:w="3456"/>
+            <w:shd w:val="clear" w:fill="EDF2FA"/>
+          </w:tcPr>
+          <w:p>
+            <w:r>
+              <w:rPr>
+                <w:rFonts w:ascii="Arial" w:hAnsi="Arial"/>
+                <w:b w:val="0"/>
+                <w:i w:val="0"/>
+                <w:color w:val="232830"/>
+                <w:sz w:val="16"/>
+              </w:rPr>
+              <w:t>Acetaminophen 650 mg Oral three times daily as needed</w:t>
+            </w:r>
+          </w:p>
+        </w:tc>
+        <w:tc>
+          <w:tcPr>
+            <w:tcW w:type="dxa" w:w="3456"/>
+            <w:shd w:val="clear" w:fill="EDF2FA"/>
+          </w:tcPr>
+          <w:p>
+            <w:r>
+              <w:rPr>
+                <w:rFonts w:ascii="Arial" w:hAnsi="Arial"/>
+                <w:b w:val="0"/>
+                <w:i w:val="0"/>
+                <w:color w:val="232830"/>
+                <w:sz w:val="16"/>
+              </w:rPr>
+              <w:t>Continue</w:t>
+            </w:r>
+          </w:p>
+        </w:tc>
+        <w:tc>
+          <w:tcPr>
+            <w:tcW w:type="dxa" w:w="3456"/>
+            <w:shd w:val="clear" w:fill="EDF2FA"/>
+          </w:tcPr>
+          <w:p>
+            <w:r>
+              <w:rPr>
+                <w:rFonts w:ascii="Arial" w:hAnsi="Arial"/>
+                <w:b w:val="0"/>
+                <w:i w:val="0"/>
+                <w:color w:val="232830"/>
+                <w:sz w:val="16"/>
+              </w:rPr>
+              <w:t>Knee osteoarthritis. NSAIDs are avoided in chronic kidney disease stage 3b.</w:t>
+            </w:r>
+          </w:p>
+        </w:tc>
+      </w:tr>
+      <w:tr>
+        <w:tc>
+          <w:tcPr>
+            <w:tcW w:type="dxa" w:w="3456"/>
+          </w:tcPr>
+          <w:p>
+            <w:r>
+              <w:rPr>
+                <w:rFonts w:ascii="Arial" w:hAnsi="Arial"/>
+                <w:b w:val="0"/>
+                <w:i w:val="0"/>
+                <w:color w:val="232830"/>
+                <w:sz w:val="16"/>
+              </w:rPr>
+              <w:t>Discharge antibiotic, deep-tissue-culture directed, renally dosed</w:t>
+            </w:r>
+          </w:p>
+        </w:tc>
+        <w:tc>
+          <w:tcPr>
+            <w:tcW w:type="dxa" w:w="3456"/>
+          </w:tcPr>
+          <w:p>
+            <w:r>
+              <w:rPr>
+                <w:rFonts w:ascii="Arial" w:hAnsi="Arial"/>
+                <w:b w:val="0"/>
+                <w:i w:val="0"/>
+                <w:color w:val="232830"/>
+                <w:sz w:val="16"/>
+              </w:rPr>
+              <w:t>Continue at a renally correct dose per infectious disease</w:t>
+            </w:r>
+          </w:p>
+        </w:tc>
+        <w:tc>
+          <w:tcPr>
+            <w:tcW w:type="dxa" w:w="3456"/>
+          </w:tcPr>
+          <w:p>
+            <w:r>
+              <w:rPr>
+                <w:rFonts w:ascii="Arial" w:hAnsi="Arial"/>
+                <w:b w:val="0"/>
+                <w:i w:val="0"/>
+                <w:color w:val="232830"/>
+                <w:sz w:val="16"/>
+              </w:rPr>
+              <w:t>Directed by the deep-tissue culture, which outranks the superficial swab. Dose to the current eGFR. Do not carry the admission piperacillin-tazobactam 2.25 g Intravenous every 8 hours dose forward unchanged. Duration is not extended for osteomyelitis, which remains unconfirmed. Physician to confirm exact agent, route, and duration.</w:t>
+            </w:r>
+          </w:p>
+        </w:tc>
+      </w:tr>
+    </w:tbl>
+    <w:p/>
+    <w:p>
+      <w:pPr>
+        <w:spacing w:before="180" w:after="60"/>
+        <w:pBdr>
+          <w:bottom w:val="single" w:sz="6" w:color="C9D4EA" w:space="2"/>
+        </w:pBdr>
+      </w:pPr>
+      <w:r>
+        <w:rPr>
+          <w:rFonts w:ascii="Arial" w:hAnsi="Arial"/>
+          <w:b/>
+          <w:i w:val="0"/>
+          <w:color w:val="4472C4"/>
+          <w:sz w:val="20"/>
+        </w:rPr>
+        <w:t>PATIENT INSTRUCTIONS (PROVIDE IN SPANISH)</w:t>
       </w:r>
     </w:p>
     <w:p>
       <w:pPr>
         <w:pStyle w:val="ListBullet"/>
+        <w:spacing w:after="30"/>
       </w:pPr>
       <w:r>
         <w:rPr>
           <w:rFonts w:ascii="Arial" w:hAnsi="Arial"/>
           <w:b w:val="0"/>
-          <w:color w:val="111111"/>
+          <w:i w:val="0"/>
+          <w:color w:val="232830"/>
           <w:sz w:val="19"/>
         </w:rPr>
         <w:t>Keep taking your night insulin and your mealtime insulin as shown.</w:t>
@@ -957,12 +1530,14 @@
     <w:p>
       <w:pPr>
         <w:pStyle w:val="ListBullet"/>
+        <w:spacing w:after="30"/>
       </w:pPr>
       <w:r>
         <w:rPr>
           <w:rFonts w:ascii="Arial" w:hAnsi="Arial"/>
           <w:b w:val="0"/>
-          <w:color w:val="111111"/>
+          <w:i w:val="0"/>
+          <w:color w:val="232830"/>
           <w:sz w:val="19"/>
         </w:rPr>
         <w:t>Do not restart metformin, empagliflozin, or lisinopril until your kidney or primary doctor tells you to.</w:t>
@@ -971,12 +1546,14 @@
     <w:p>
       <w:pPr>
         <w:pStyle w:val="ListBullet"/>
+        <w:spacing w:after="30"/>
       </w:pPr>
       <w:r>
         <w:rPr>
           <w:rFonts w:ascii="Arial" w:hAnsi="Arial"/>
           <w:b w:val="0"/>
-          <w:color w:val="111111"/>
+          <w:i w:val="0"/>
+          <w:color w:val="232830"/>
           <w:sz w:val="19"/>
         </w:rPr>
         <w:t>For knee pain use acetaminophen. Do not use ibuprofen, naproxen, or other anti-inflammatory pain pills.</w:t>
@@ -985,12 +1562,14 @@
     <w:p>
       <w:pPr>
         <w:pStyle w:val="ListBullet"/>
+        <w:spacing w:after="30"/>
       </w:pPr>
       <w:r>
         <w:rPr>
           <w:rFonts w:ascii="Arial" w:hAnsi="Arial"/>
           <w:b w:val="0"/>
-          <w:color w:val="111111"/>
+          <w:i w:val="0"/>
+          <w:color w:val="232830"/>
           <w:sz w:val="19"/>
         </w:rPr>
         <w:t>Take your antibiotic exactly as written and finish the full course.</w:t>
@@ -999,12 +1578,14 @@
     <w:p>
       <w:pPr>
         <w:pStyle w:val="ListBullet"/>
+        <w:spacing w:after="30"/>
       </w:pPr>
       <w:r>
         <w:rPr>
           <w:rFonts w:ascii="Arial" w:hAnsi="Arial"/>
           <w:b w:val="0"/>
-          <w:color w:val="111111"/>
+          <w:i w:val="0"/>
+          <w:color w:val="232830"/>
           <w:sz w:val="19"/>
         </w:rPr>
         <w:t>Care for your foot wound as instructed and keep all follow-up visits.</w:t>
@@ -1013,24 +1594,33 @@
     <w:p>
       <w:pPr>
         <w:pStyle w:val="ListBullet"/>
+        <w:spacing w:after="30"/>
       </w:pPr>
       <w:r>
         <w:rPr>
           <w:rFonts w:ascii="Arial" w:hAnsi="Arial"/>
           <w:b w:val="0"/>
-          <w:color w:val="111111"/>
+          <w:i w:val="0"/>
+          <w:color w:val="232830"/>
           <w:sz w:val="19"/>
         </w:rPr>
         <w:t>Call your care team or seek care for fever, chills, increased foot redness, drainage, odor, or feeling very unwell.</w:t>
       </w:r>
     </w:p>
     <w:p>
+      <w:pPr>
+        <w:spacing w:before="180" w:after="60"/>
+        <w:pBdr>
+          <w:bottom w:val="single" w:sz="6" w:color="C9D4EA" w:space="2"/>
+        </w:pBdr>
+      </w:pPr>
       <w:r>
         <w:rPr>
           <w:rFonts w:ascii="Arial" w:hAnsi="Arial"/>
           <w:b/>
-          <w:color w:val="1F3864"/>
-          <w:sz w:val="22"/>
+          <w:i w:val="0"/>
+          <w:color w:val="4472C4"/>
+          <w:sz w:val="20"/>
         </w:rPr>
         <w:t>FLAGS FOR PHYSICIAN BEFORE SIGN</w:t>
       </w:r>
@@ -1038,12 +1628,14 @@
     <w:p>
       <w:pPr>
         <w:pStyle w:val="ListBullet"/>
+        <w:spacing w:after="30"/>
       </w:pPr>
       <w:r>
         <w:rPr>
           <w:rFonts w:ascii="Arial" w:hAnsi="Arial"/>
           <w:b w:val="0"/>
-          <w:color w:val="111111"/>
+          <w:i w:val="0"/>
+          <w:color w:val="232830"/>
           <w:sz w:val="19"/>
         </w:rPr>
         <w:t>Exact discharge antibiotic agent, route, and duration, renally dosed and deep-culture directed. The sulfa allergy excludes trimethoprim-sulfamethoxazole.</w:t>
@@ -1052,37 +1644,162 @@
     <w:p>
       <w:pPr>
         <w:pStyle w:val="ListBullet"/>
+        <w:spacing w:after="30"/>
       </w:pPr>
       <w:r>
         <w:rPr>
           <w:rFonts w:ascii="Arial" w:hAnsi="Arial"/>
           <w:b w:val="0"/>
-          <w:color w:val="111111"/>
+          <w:i w:val="0"/>
+          <w:color w:val="232830"/>
           <w:sz w:val="19"/>
         </w:rPr>
         <w:t>Restart parameters and timing for metformin, empagliflozin, and lisinopril at outpatient follow-up.</w:t>
       </w:r>
     </w:p>
-    <w:p/>
     <w:p>
+      <w:pPr>
+        <w:spacing w:before="200"/>
+        <w:pBdr>
+          <w:top w:val="single" w:sz="4" w:color="C9D4EA" w:space="4"/>
+        </w:pBdr>
+      </w:pPr>
       <w:r>
         <w:rPr>
           <w:rFonts w:ascii="Arial" w:hAnsi="Arial"/>
           <w:b w:val="0"/>
+          <w:i/>
           <w:color w:val="5E6670"/>
           <w:sz w:val="18"/>
         </w:rPr>
-        <w:t>Electronically signed by Marisol Everet, MD  |  Hospital Medicine  |  05/22/2026 0830</w:t>
+        <w:t>Electronically signed by Marisol Everet, MD | Hospital Medicine | 05/22/2026 0830</w:t>
       </w:r>
     </w:p>
     <w:sectPr>
+      <w:headerReference w:type="default" r:id="rId9"/>
+      <w:footerReference w:type="default" r:id="rId10"/>
+      <w:headerReference w:type="even" r:id="rId11"/>
+      <w:footerReference w:type="even" r:id="rId12"/>
+      <w:headerReference w:type="first" r:id="rId13"/>
+      <w:footerReference w:type="first" r:id="rId14"/>
       <w:pgSz w:w="12240" w:h="15840"/>
-      <w:pgMar w:top="1440" w:right="1800" w:bottom="1440" w:left="1800" w:header="720" w:footer="720" w:gutter="0"/>
+      <w:pgMar w:top="720" w:right="936" w:bottom="792" w:left="936" w:header="720" w:footer="720" w:gutter="0"/>
       <w:cols w:space="720"/>
       <w:docGrid w:linePitch="360"/>
     </w:sectPr>
   </w:body>
 </w:document>
+</file>
+
+<file path=word/footer1.xml><?xml version="1.0" encoding="utf-8"?>
+<w:ftr xmlns:m="http://schemas.openxmlformats.org/officeDocument/2006/math" xmlns:mc="http://schemas.openxmlformats.org/markup-compatibility/2006" xmlns:mo="http://schemas.microsoft.com/office/mac/office/2008/main" xmlns:mv="urn:schemas-microsoft-com:mac:vml" xmlns:o="urn:schemas-microsoft-com:office:office" xmlns:r="http://schemas.openxmlformats.org/officeDocument/2006/relationships" xmlns:v="urn:schemas-microsoft-com:vml" xmlns:w10="urn:schemas-microsoft-com:office:word" xmlns:w14="http://schemas.microsoft.com/office/word/2010/wordml" xmlns:w="http://schemas.openxmlformats.org/wordprocessingml/2006/main" xmlns:wne="http://schemas.microsoft.com/office/word/2006/wordml" xmlns:wp14="http://schemas.microsoft.com/office/word/2010/wordprocessingDrawing" xmlns:wp="http://schemas.openxmlformats.org/drawingml/2006/wordprocessingDrawing" xmlns:wpc="http://schemas.microsoft.com/office/word/2010/wordprocessingCanvas" xmlns:wpg="http://schemas.microsoft.com/office/word/2010/wordprocessingGroup" xmlns:wpi="http://schemas.microsoft.com/office/word/2010/wordprocessingInk" xmlns:wps="http://schemas.microsoft.com/office/word/2010/wordprocessingShape" mc:Ignorable="w14 wp14">
+  <w:p>
+    <w:pPr>
+      <w:jc w:val="center"/>
+    </w:pPr>
+    <w:r>
+      <w:rPr>
+        <w:rFonts w:ascii="Arial" w:hAnsi="Arial"/>
+        <w:b w:val="0"/>
+        <w:i w:val="0"/>
+        <w:color w:val="5E6670"/>
+        <w:sz w:val="15"/>
+      </w:rPr>
+      <w:t>Harbor Crest Regional Medical Center  |  DISCHARGE MEDICATION RECONCILIATION  |  Confidential</w:t>
+    </w:r>
+  </w:p>
+</w:ftr>
+</file>
+
+<file path=word/footer2.xml><?xml version="1.0" encoding="utf-8"?>
+<w:ftr xmlns:m="http://schemas.openxmlformats.org/officeDocument/2006/math" xmlns:mc="http://schemas.openxmlformats.org/markup-compatibility/2006" xmlns:mo="http://schemas.microsoft.com/office/mac/office/2008/main" xmlns:mv="urn:schemas-microsoft-com:mac:vml" xmlns:o="urn:schemas-microsoft-com:office:office" xmlns:r="http://schemas.openxmlformats.org/officeDocument/2006/relationships" xmlns:v="urn:schemas-microsoft-com:vml" xmlns:w10="urn:schemas-microsoft-com:office:word" xmlns:w14="http://schemas.microsoft.com/office/word/2010/wordml" xmlns:w="http://schemas.openxmlformats.org/wordprocessingml/2006/main" xmlns:wne="http://schemas.microsoft.com/office/word/2006/wordml" xmlns:wp14="http://schemas.microsoft.com/office/word/2010/wordprocessingDrawing" xmlns:wp="http://schemas.openxmlformats.org/drawingml/2006/wordprocessingDrawing" xmlns:wpc="http://schemas.microsoft.com/office/word/2010/wordprocessingCanvas" xmlns:wpg="http://schemas.microsoft.com/office/word/2010/wordprocessingGroup" xmlns:wpi="http://schemas.microsoft.com/office/word/2010/wordprocessingInk" xmlns:wps="http://schemas.microsoft.com/office/word/2010/wordprocessingShape" mc:Ignorable="w14 wp14">
+  <w:p>
+    <w:pPr>
+      <w:jc w:val="center"/>
+    </w:pPr>
+    <w:r>
+      <w:rPr>
+        <w:rFonts w:ascii="Arial" w:hAnsi="Arial"/>
+        <w:b w:val="0"/>
+        <w:i w:val="0"/>
+        <w:color w:val="5E6670"/>
+        <w:sz w:val="15"/>
+      </w:rPr>
+      <w:t>Harbor Crest Regional Medical Center  |  DISCHARGE MEDICATION RECONCILIATION  |  Confidential</w:t>
+    </w:r>
+  </w:p>
+</w:ftr>
+</file>
+
+<file path=word/footer3.xml><?xml version="1.0" encoding="utf-8"?>
+<w:ftr xmlns:m="http://schemas.openxmlformats.org/officeDocument/2006/math" xmlns:mc="http://schemas.openxmlformats.org/markup-compatibility/2006" xmlns:mo="http://schemas.microsoft.com/office/mac/office/2008/main" xmlns:mv="urn:schemas-microsoft-com:mac:vml" xmlns:o="urn:schemas-microsoft-com:office:office" xmlns:r="http://schemas.openxmlformats.org/officeDocument/2006/relationships" xmlns:v="urn:schemas-microsoft-com:vml" xmlns:w10="urn:schemas-microsoft-com:office:word" xmlns:w14="http://schemas.microsoft.com/office/word/2010/wordml" xmlns:w="http://schemas.openxmlformats.org/wordprocessingml/2006/main" xmlns:wne="http://schemas.microsoft.com/office/word/2006/wordml" xmlns:wp14="http://schemas.microsoft.com/office/word/2010/wordprocessingDrawing" xmlns:wp="http://schemas.openxmlformats.org/drawingml/2006/wordprocessingDrawing" xmlns:wpc="http://schemas.microsoft.com/office/word/2010/wordprocessingCanvas" xmlns:wpg="http://schemas.microsoft.com/office/word/2010/wordprocessingGroup" xmlns:wpi="http://schemas.microsoft.com/office/word/2010/wordprocessingInk" xmlns:wps="http://schemas.microsoft.com/office/word/2010/wordprocessingShape" mc:Ignorable="w14 wp14">
+  <w:p>
+    <w:pPr>
+      <w:jc w:val="center"/>
+    </w:pPr>
+    <w:r>
+      <w:rPr>
+        <w:rFonts w:ascii="Arial" w:hAnsi="Arial"/>
+        <w:b w:val="0"/>
+        <w:i w:val="0"/>
+        <w:color w:val="5E6670"/>
+        <w:sz w:val="15"/>
+      </w:rPr>
+      <w:t>Harbor Crest Regional Medical Center  |  DISCHARGE MEDICATION RECONCILIATION  |  Confidential</w:t>
+    </w:r>
+  </w:p>
+</w:ftr>
+</file>
+
+<file path=word/header1.xml><?xml version="1.0" encoding="utf-8"?>
+<w:hdr xmlns:m="http://schemas.openxmlformats.org/officeDocument/2006/math" xmlns:mc="http://schemas.openxmlformats.org/markup-compatibility/2006" xmlns:mo="http://schemas.microsoft.com/office/mac/office/2008/main" xmlns:mv="urn:schemas-microsoft-com:mac:vml" xmlns:o="urn:schemas-microsoft-com:office:office" xmlns:r="http://schemas.openxmlformats.org/officeDocument/2006/relationships" xmlns:v="urn:schemas-microsoft-com:vml" xmlns:w10="urn:schemas-microsoft-com:office:word" xmlns:w14="http://schemas.microsoft.com/office/word/2010/wordml" xmlns:w="http://schemas.openxmlformats.org/wordprocessingml/2006/main" xmlns:wne="http://schemas.microsoft.com/office/word/2006/wordml" xmlns:wp14="http://schemas.microsoft.com/office/word/2010/wordprocessingDrawing" xmlns:wp="http://schemas.openxmlformats.org/drawingml/2006/wordprocessingDrawing" xmlns:wpc="http://schemas.microsoft.com/office/word/2010/wordprocessingCanvas" xmlns:wpg="http://schemas.microsoft.com/office/word/2010/wordprocessingGroup" xmlns:wpi="http://schemas.microsoft.com/office/word/2010/wordprocessingInk" xmlns:wps="http://schemas.microsoft.com/office/word/2010/wordprocessingShape" mc:Ignorable="w14 wp14">
+  <w:p>
+    <w:r>
+      <w:rPr>
+        <w:rFonts w:ascii="Arial" w:hAnsi="Arial"/>
+        <w:b w:val="0"/>
+        <w:i w:val="0"/>
+        <w:color w:val="5E6670"/>
+        <w:sz w:val="15"/>
+      </w:rPr>
+      <w:t>Ondina Vasquell  |  MRN OV-3358104</w:t>
+    </w:r>
+  </w:p>
+</w:hdr>
+</file>
+
+<file path=word/header2.xml><?xml version="1.0" encoding="utf-8"?>
+<w:hdr xmlns:m="http://schemas.openxmlformats.org/officeDocument/2006/math" xmlns:mc="http://schemas.openxmlformats.org/markup-compatibility/2006" xmlns:mo="http://schemas.microsoft.com/office/mac/office/2008/main" xmlns:mv="urn:schemas-microsoft-com:mac:vml" xmlns:o="urn:schemas-microsoft-com:office:office" xmlns:r="http://schemas.openxmlformats.org/officeDocument/2006/relationships" xmlns:v="urn:schemas-microsoft-com:vml" xmlns:w10="urn:schemas-microsoft-com:office:word" xmlns:w14="http://schemas.microsoft.com/office/word/2010/wordml" xmlns:w="http://schemas.openxmlformats.org/wordprocessingml/2006/main" xmlns:wne="http://schemas.microsoft.com/office/word/2006/wordml" xmlns:wp14="http://schemas.microsoft.com/office/word/2010/wordprocessingDrawing" xmlns:wp="http://schemas.openxmlformats.org/drawingml/2006/wordprocessingDrawing" xmlns:wpc="http://schemas.microsoft.com/office/word/2010/wordprocessingCanvas" xmlns:wpg="http://schemas.microsoft.com/office/word/2010/wordprocessingGroup" xmlns:wpi="http://schemas.microsoft.com/office/word/2010/wordprocessingInk" xmlns:wps="http://schemas.microsoft.com/office/word/2010/wordprocessingShape" mc:Ignorable="w14 wp14">
+  <w:p>
+    <w:r>
+      <w:rPr>
+        <w:rFonts w:ascii="Arial" w:hAnsi="Arial"/>
+        <w:b w:val="0"/>
+        <w:i w:val="0"/>
+        <w:color w:val="5E6670"/>
+        <w:sz w:val="15"/>
+      </w:rPr>
+      <w:t>Ondina Vasquell  |  MRN OV-3358104</w:t>
+    </w:r>
+  </w:p>
+</w:hdr>
+</file>
+
+<file path=word/header3.xml><?xml version="1.0" encoding="utf-8"?>
+<w:hdr xmlns:m="http://schemas.openxmlformats.org/officeDocument/2006/math" xmlns:mc="http://schemas.openxmlformats.org/markup-compatibility/2006" xmlns:mo="http://schemas.microsoft.com/office/mac/office/2008/main" xmlns:mv="urn:schemas-microsoft-com:mac:vml" xmlns:o="urn:schemas-microsoft-com:office:office" xmlns:r="http://schemas.openxmlformats.org/officeDocument/2006/relationships" xmlns:v="urn:schemas-microsoft-com:vml" xmlns:w10="urn:schemas-microsoft-com:office:word" xmlns:w14="http://schemas.microsoft.com/office/word/2010/wordml" xmlns:w="http://schemas.openxmlformats.org/wordprocessingml/2006/main" xmlns:wne="http://schemas.microsoft.com/office/word/2006/wordml" xmlns:wp14="http://schemas.microsoft.com/office/word/2010/wordprocessingDrawing" xmlns:wp="http://schemas.openxmlformats.org/drawingml/2006/wordprocessingDrawing" xmlns:wpc="http://schemas.microsoft.com/office/word/2010/wordprocessingCanvas" xmlns:wpg="http://schemas.microsoft.com/office/word/2010/wordprocessingGroup" xmlns:wpi="http://schemas.microsoft.com/office/word/2010/wordprocessingInk" xmlns:wps="http://schemas.microsoft.com/office/word/2010/wordprocessingShape" mc:Ignorable="w14 wp14">
+  <w:p>
+    <w:r>
+      <w:rPr>
+        <w:rFonts w:ascii="Arial" w:hAnsi="Arial"/>
+        <w:b w:val="0"/>
+        <w:i w:val="0"/>
+        <w:color w:val="5E6670"/>
+        <w:sz w:val="15"/>
+      </w:rPr>
+      <w:t>Ondina Vasquell  |  MRN OV-3358104</w:t>
+    </w:r>
+  </w:p>
+</w:hdr>
 </file>
 
 <file path=word/numbering.xml><?xml version="1.0" encoding="utf-8"?>
@@ -1450,7 +2167,7 @@
     <w:rsid w:val="00FC693F"/>
     <w:rPr>
       <w:rFonts w:ascii="Arial" w:hAnsi="Arial"/>
-      <w:sz w:val="21"/>
+      <w:sz w:val="19"/>
     </w:rPr>
   </w:style>
   <w:style w:type="paragraph" w:styleId="Header">

</xml_diff>

<commit_message>
Audit response (Alexander 6/13): F1 culture DoS=collection; F2 rename attending Marisol->Lillian Everet (all docx); N2 convention; EW31 image spec fixed (bilateral NC + ordering clinician) flagged for regen; adversarial deep-read PASS; gate 60 PASS
</commit_message>
<xml_diff>
--- a/worlds/ondina-vasquell/phase-3-build-task-artifacts/platform/task1/current/golden-OV01-v1.docx
+++ b/worlds/ondina-vasquell/phase-3-build-task-artifacts/platform/task1/current/golden-OV01-v1.docx
@@ -226,7 +226,7 @@
                 <w:color w:val="232830"/>
                 <w:sz w:val="16"/>
               </w:rPr>
-              <w:t>Marisol Everet, MD</w:t>
+              <w:t>Lillian Everet, MD</w:t>
             </w:r>
           </w:p>
         </w:tc>
@@ -312,7 +312,7 @@
           <w:color w:val="5E6670"/>
           <w:sz w:val="16"/>
         </w:rPr>
-        <w:t>Author: Marisol Everet, MD - Hospital Medicine | Date of Service: 05/22/2026 0830 | Status: Draft for physician sign</w:t>
+        <w:t>Author: Lillian Everet, MD - Hospital Medicine | Date of Service: 05/22/2026 0830 | Status: Draft for physician sign</w:t>
       </w:r>
     </w:p>
     <w:p>
@@ -484,7 +484,7 @@
           <w:color w:val="232830"/>
           <w:sz w:val="18"/>
         </w:rPr>
-        <w:t>Marisol Everet, MD</w:t>
+        <w:t>Lillian Everet, MD</w:t>
       </w:r>
     </w:p>
     <w:p>
@@ -1672,7 +1672,7 @@
           <w:color w:val="5E6670"/>
           <w:sz w:val="18"/>
         </w:rPr>
-        <w:t>Electronically signed by Marisol Everet, MD | Hospital Medicine | 05/22/2026 0830</w:t>
+        <w:t>Electronically signed by Lillian Everet, MD | Hospital Medicine | 05/22/2026 0830</w:t>
       </w:r>
     </w:p>
     <w:sectPr>

</xml_diff>